<commit_message>
fix(materials): validate and correct final A components
</commit_message>
<xml_diff>
--- a/docs/submission/claude-final-materials/A-TECHNICAL-APPENDIX.docx
+++ b/docs/submission/claude-final-materials/A-TECHNICAL-APPENDIX.docx
@@ -4,15 +4,13 @@
   <w:body>
     <w:p>
       <w:pPr>
-        <w:spacing w:after="200"/>
-        <w:jc w:val="left"/>
+        <w:keepNext/>
       </w:pPr>
       <w:r>
         <w:rPr>
           <w:rFonts w:ascii="Microsoft YaHei" w:hAnsi="Microsoft YaHei" w:eastAsia="微软雅黑"/>
           <w:b/>
-          <w:i w:val="0"/>
-          <w:color w:val="000000"/>
+          <w:color w:val="1F2937"/>
           <w:sz w:val="40"/>
         </w:rPr>
         <w:t>A 技术附件（设备、共享入口与 A→C 接线）</w:t>
@@ -20,74 +18,29 @@
     </w:p>
     <w:p>
       <w:pPr>
-        <w:spacing w:after="200" w:line="276" w:lineRule="auto"/>
+        <w:widowControl/>
+        <w:spacing w:after="120" w:line="288" w:lineRule="auto"/>
       </w:pPr>
       <w:r>
         <w:rPr>
           <w:rFonts w:ascii="Microsoft YaHei" w:hAnsi="Microsoft YaHei" w:eastAsia="微软雅黑"/>
           <w:b w:val="0"/>
-          <w:i w:val="0"/>
-          <w:color w:val="555F6B"/>
+          <w:color w:val="1F2937"/>
           <w:sz w:val="20"/>
         </w:rPr>
-        <w:t>M03 候选章节，供 B 直接汇编设计文档。软件来源固定 main0e</w:t>
-      </w:r>
-    </w:p>
-    <w:p>
-      <w:pPr>
-        <w:spacing w:after="200" w:line="276" w:lineRule="auto"/>
-      </w:pPr>
-      <w:r>
-        <w:rPr>
-          <w:rFonts w:ascii="Microsoft YaHei" w:hAnsi="Microsoft YaHei" w:eastAsia="微软雅黑"/>
-          <w:b w:val="0"/>
-          <w:i w:val="0"/>
-          <w:color w:val="555F6B"/>
-          <w:sz w:val="20"/>
-        </w:rPr>
-        <w:t>`0e508d147517f81dfe2b9245c45c0c0e30076592`（PR82/88 已合并），不是后来 main，</w:t>
-      </w:r>
-    </w:p>
-    <w:p>
-      <w:pPr>
-        <w:spacing w:after="200" w:line="276" w:lineRule="auto"/>
-      </w:pPr>
-      <w:r>
-        <w:rPr>
-          <w:rFonts w:ascii="Microsoft YaHei" w:hAnsi="Microsoft YaHei" w:eastAsia="微软雅黑"/>
-          <w:b w:val="0"/>
-          <w:i w:val="0"/>
-          <w:color w:val="555F6B"/>
-          <w:sz w:val="20"/>
-        </w:rPr>
-        <w:t>也不代表完整 E1、两通知实收、第二机或 M01—M05 已签收。本文只陈述真实已验证范围，</w:t>
-      </w:r>
-    </w:p>
-    <w:p>
-      <w:pPr>
-        <w:spacing w:after="200" w:line="276" w:lineRule="auto"/>
-      </w:pPr>
-      <w:r>
-        <w:rPr>
-          <w:rFonts w:ascii="Microsoft YaHei" w:hAnsi="Microsoft YaHei" w:eastAsia="微软雅黑"/>
-          <w:b w:val="0"/>
-          <w:i w:val="0"/>
-          <w:color w:val="555F6B"/>
-          <w:sz w:val="20"/>
-        </w:rPr>
-        <w:t>未完成项不写成通过；C/B 证据明确归属，不代三方签收。</w:t>
+        <w:t>M03 候选章节，供 B 直接汇编设计文档。软件来源固定 main0e 0e508d147517f81dfe2b9245c45c0c0e30076592（PR82/88 已合并），不是后来 main，也不代表完整 E1、两通知实收、第二机或 M01—M05 已签收。本文只陈述真实已验证范围，未完成项不写成通过；C/B 证据明确归属，不代三方签收。</w:t>
       </w:r>
     </w:p>
     <w:p>
       <w:pPr>
         <w:pStyle w:val="Heading2"/>
+        <w:keepNext/>
       </w:pPr>
       <w:r>
         <w:rPr>
           <w:rFonts w:ascii="Microsoft YaHei" w:hAnsi="Microsoft YaHei" w:eastAsia="微软雅黑"/>
           <w:b/>
-          <w:i w:val="0"/>
-          <w:color w:val="000000"/>
+          <w:color w:val="1F2937"/>
           <w:sz w:val="30"/>
         </w:rPr>
         <w:t>一、范围与非物理试验声明</w:t>
@@ -95,134 +48,44 @@
     </w:p>
     <w:p>
       <w:pPr>
+        <w:widowControl/>
         <w:spacing w:after="120" w:line="288" w:lineRule="auto"/>
       </w:pPr>
       <w:r>
         <w:rPr>
           <w:rFonts w:ascii="Microsoft YaHei" w:hAnsi="Microsoft YaHei" w:eastAsia="微软雅黑"/>
           <w:b w:val="0"/>
-          <w:i w:val="0"/>
           <w:color w:val="1F2937"/>
           <w:sz w:val="22"/>
         </w:rPr>
-        <w:t>系统面向两座苹果冷库、三批同品种苹果，软件模拟七个测区，每区一个温度采集身份与一个</w:t>
+        <w:t>系统面向两座苹果冷库、三批同品种苹果，软件模拟七个测区，每区一个温度采集身份与一个制冷执行身份，共十四个逻辑设备。主要操作包括：注册并绑定设备、查看在线状态、持续查看原始/清洗数据、查询同筛选历史与 CSV、下发制冷命令、核对设备执行 ACK 与后续温度、处置异常并保留追溯。通知须 SMTP 与飞书手机端两个独立渠道授权实收，服务接受不等于终端实收。</w:t>
       </w:r>
     </w:p>
     <w:p>
       <w:pPr>
+        <w:widowControl/>
         <w:spacing w:after="120" w:line="288" w:lineRule="auto"/>
       </w:pPr>
       <w:r>
         <w:rPr>
           <w:rFonts w:ascii="Microsoft YaHei" w:hAnsi="Microsoft YaHei" w:eastAsia="微软雅黑"/>
           <w:b w:val="0"/>
-          <w:i w:val="0"/>
           <w:color w:val="1F2937"/>
           <w:sz w:val="22"/>
         </w:rPr>
-        <w:t>制冷执行身份，共十四个逻辑设备。主要操作包括：注册并绑定设备、查看在线状态、持续查看</w:t>
-      </w:r>
-    </w:p>
-    <w:p>
-      <w:pPr>
-        <w:spacing w:after="120" w:line="288" w:lineRule="auto"/>
-      </w:pPr>
-      <w:r>
-        <w:rPr>
-          <w:rFonts w:ascii="Microsoft YaHei" w:hAnsi="Microsoft YaHei" w:eastAsia="微软雅黑"/>
-          <w:b w:val="0"/>
-          <w:i w:val="0"/>
-          <w:color w:val="1F2937"/>
-          <w:sz w:val="22"/>
-        </w:rPr>
-        <w:t>原始/清洗数据、查询同筛选历史与 CSV、下发制冷命令、核对设备执行 ACK 与后续温度、处置</w:t>
-      </w:r>
-    </w:p>
-    <w:p>
-      <w:pPr>
-        <w:spacing w:after="120" w:line="288" w:lineRule="auto"/>
-      </w:pPr>
-      <w:r>
-        <w:rPr>
-          <w:rFonts w:ascii="Microsoft YaHei" w:hAnsi="Microsoft YaHei" w:eastAsia="微软雅黑"/>
-          <w:b w:val="0"/>
-          <w:i w:val="0"/>
-          <w:color w:val="1F2937"/>
-          <w:sz w:val="22"/>
-        </w:rPr>
-        <w:t>异常并保留追溯。通知须 SMTP 与飞书手机端两个独立渠道授权实收，服务接受不等于终端实收。</w:t>
-      </w:r>
-    </w:p>
-    <w:p>
-      <w:pPr>
-        <w:spacing w:after="120" w:line="288" w:lineRule="auto"/>
-      </w:pPr>
-      <w:r>
-        <w:rPr>
-          <w:rFonts w:ascii="Microsoft YaHei" w:hAnsi="Microsoft YaHei" w:eastAsia="微软雅黑"/>
-          <w:b w:val="0"/>
-          <w:i w:val="0"/>
-          <w:color w:val="1F2937"/>
-          <w:sz w:val="22"/>
-        </w:rPr>
-        <w:t>本项目的温度与制冷数据来自软件模拟，不是实物果品实验；阈值异常不宣称为真实腐败概率。</w:t>
-      </w:r>
-    </w:p>
-    <w:p>
-      <w:pPr>
-        <w:spacing w:after="120" w:line="288" w:lineRule="auto"/>
-      </w:pPr>
-      <w:r>
-        <w:rPr>
-          <w:rFonts w:ascii="Microsoft YaHei" w:hAnsi="Microsoft YaHei" w:eastAsia="微软雅黑"/>
-          <w:b w:val="0"/>
-          <w:i w:val="0"/>
-          <w:color w:val="1F2937"/>
-          <w:sz w:val="22"/>
-        </w:rPr>
-        <w:t>算法是可选加分项，本附件不涉及。项目不要求采购硬件或付费服务器，交付用软件模拟与隔离</w:t>
-      </w:r>
-    </w:p>
-    <w:p>
-      <w:pPr>
-        <w:spacing w:after="120" w:line="288" w:lineRule="auto"/>
-      </w:pPr>
-      <w:r>
-        <w:rPr>
-          <w:rFonts w:ascii="Microsoft YaHei" w:hAnsi="Microsoft YaHei" w:eastAsia="微软雅黑"/>
-          <w:b w:val="0"/>
-          <w:i w:val="0"/>
-          <w:color w:val="1F2937"/>
-          <w:sz w:val="22"/>
-        </w:rPr>
-        <w:t>容器验证。所有涉及“已通过”的表述只对应下方列出的候选与分段证据，不与不同版本测试数</w:t>
-      </w:r>
-    </w:p>
-    <w:p>
-      <w:pPr>
-        <w:spacing w:after="120" w:line="288" w:lineRule="auto"/>
-      </w:pPr>
-      <w:r>
-        <w:rPr>
-          <w:rFonts w:ascii="Microsoft YaHei" w:hAnsi="Microsoft YaHei" w:eastAsia="微软雅黑"/>
-          <w:b w:val="0"/>
-          <w:i w:val="0"/>
-          <w:color w:val="1F2937"/>
-          <w:sz w:val="22"/>
-        </w:rPr>
-        <w:t>相加，也不把隔离回归写成业务现场验收。</w:t>
+        <w:t>本项目的温度与制冷数据来自软件模拟，不是实物果品实验；阈值异常不宣称为真实腐败概率。算法是可选加分项，本附件不涉及。项目不要求采购硬件或付费服务器，交付用软件模拟与隔离容器验证。所有涉及“已通过”的表述只对应下方列出的候选与分段证据，不与不同版本测试数相加，也不把隔离回归写成业务现场验收。</w:t>
       </w:r>
     </w:p>
     <w:p>
       <w:pPr>
         <w:pStyle w:val="Heading2"/>
+        <w:keepNext/>
       </w:pPr>
       <w:r>
         <w:rPr>
           <w:rFonts w:ascii="Microsoft YaHei" w:hAnsi="Microsoft YaHei" w:eastAsia="微软雅黑"/>
           <w:b/>
-          <w:i w:val="0"/>
-          <w:color w:val="000000"/>
+          <w:color w:val="1F2937"/>
           <w:sz w:val="30"/>
         </w:rPr>
         <w:t>二、部署与模块分层</w:t>
@@ -231,13 +94,13 @@
     <w:p>
       <w:pPr>
         <w:pStyle w:val="ListBullet"/>
-        <w:spacing w:after="60" w:line="276" w:lineRule="auto"/>
+        <w:widowControl/>
+        <w:spacing w:after="120" w:line="288" w:lineRule="auto"/>
       </w:pPr>
       <w:r>
         <w:rPr>
           <w:rFonts w:ascii="Microsoft YaHei" w:hAnsi="Microsoft YaHei" w:eastAsia="微软雅黑"/>
           <w:b w:val="0"/>
-          <w:i w:val="0"/>
           <w:color w:val="1F2937"/>
           <w:sz w:val="22"/>
         </w:rPr>
@@ -247,231 +110,61 @@
     <w:p>
       <w:pPr>
         <w:pStyle w:val="ListBullet"/>
-        <w:spacing w:after="60" w:line="276" w:lineRule="auto"/>
-      </w:pPr>
-      <w:r>
-        <w:rPr>
-          <w:rFonts w:ascii="Microsoft YaHei" w:hAnsi="Microsoft YaHei" w:eastAsia="微软雅黑"/>
-          <w:b w:val="0"/>
-          <w:i w:val="0"/>
-          <w:color w:val="1F2937"/>
-          <w:sz w:val="22"/>
-        </w:rPr>
-        <w:t>HTTP 层：FastAPI。</w:t>
-      </w:r>
-      <w:r>
-        <w:rPr>
-          <w:rFonts w:ascii="Microsoft YaHei" w:hAnsi="Microsoft YaHei" w:eastAsia="微软雅黑"/>
-          <w:b w:val="0"/>
-          <w:i w:val="0"/>
-          <w:color w:val="1F2937"/>
-          <w:sz w:val="21"/>
-        </w:rPr>
-        <w:t>backend/app/main.py</w:t>
-      </w:r>
-      <w:r>
-        <w:rPr>
-          <w:rFonts w:ascii="Microsoft YaHei" w:hAnsi="Microsoft YaHei" w:eastAsia="微软雅黑"/>
-          <w:b w:val="0"/>
-          <w:i w:val="0"/>
-          <w:color w:val="1F2937"/>
-          <w:sz w:val="22"/>
-        </w:rPr>
-        <w:t xml:space="preserve"> 仅在总入口加一次 </w:t>
-      </w:r>
-      <w:r>
-        <w:rPr>
-          <w:rFonts w:ascii="Microsoft YaHei" w:hAnsi="Microsoft YaHei" w:eastAsia="微软雅黑"/>
-          <w:b w:val="0"/>
-          <w:i w:val="0"/>
-          <w:color w:val="1F2937"/>
-          <w:sz w:val="21"/>
-        </w:rPr>
-        <w:t>settings.API_V1_STR</w:t>
-      </w:r>
-      <w:r>
-        <w:rPr>
-          <w:rFonts w:ascii="Microsoft YaHei" w:hAnsi="Microsoft YaHei" w:eastAsia="微软雅黑"/>
-          <w:b w:val="0"/>
-          <w:i w:val="0"/>
-          <w:color w:val="1F2937"/>
-          <w:sz w:val="22"/>
-        </w:rPr>
-        <w:t>，</w:t>
-      </w:r>
-    </w:p>
-    <w:p>
-      <w:pPr>
+        <w:widowControl/>
         <w:spacing w:after="120" w:line="288" w:lineRule="auto"/>
       </w:pPr>
       <w:r>
         <w:rPr>
           <w:rFonts w:ascii="Microsoft YaHei" w:hAnsi="Microsoft YaHei" w:eastAsia="微软雅黑"/>
           <w:b w:val="0"/>
-          <w:i w:val="0"/>
-          <w:color w:val="1F2937"/>
-          <w:sz w:val="21"/>
-        </w:rPr>
-        <w:t>backend/app/api/main.py</w:t>
-      </w:r>
-      <w:r>
-        <w:rPr>
-          <w:rFonts w:ascii="Microsoft YaHei" w:hAnsi="Microsoft YaHei" w:eastAsia="微软雅黑"/>
-          <w:b w:val="0"/>
-          <w:i w:val="0"/>
           <w:color w:val="1F2937"/>
           <w:sz w:val="22"/>
         </w:rPr>
-        <w:t xml:space="preserve"> 聚合子路由，不在 alerts 聚合器上再加 </w:t>
-      </w:r>
-      <w:r>
-        <w:rPr>
-          <w:rFonts w:ascii="Microsoft YaHei" w:hAnsi="Microsoft YaHei" w:eastAsia="微软雅黑"/>
-          <w:b w:val="0"/>
-          <w:i w:val="0"/>
-          <w:color w:val="1F2937"/>
-          <w:sz w:val="21"/>
-        </w:rPr>
-        <w:t>/api/v1</w:t>
-      </w:r>
-      <w:r>
-        <w:rPr>
-          <w:rFonts w:ascii="Microsoft YaHei" w:hAnsi="Microsoft YaHei" w:eastAsia="微软雅黑"/>
-          <w:b w:val="0"/>
-          <w:i w:val="0"/>
-          <w:color w:val="1F2937"/>
-          <w:sz w:val="22"/>
-        </w:rPr>
-        <w:t>；设备绑定、</w:t>
+        <w:t>HTTP 层：FastAPI。backend/app/main.py 仅在总入口加一次 settings.API_V1_STR，backend/app/api/main.py 聚合子路由，不在 alerts 聚合器上再加 /api/v1；设备绑定、控制和遥测子路由复用公共登录权限。</w:t>
       </w:r>
     </w:p>
     <w:p>
       <w:pPr>
+        <w:pStyle w:val="ListBullet"/>
+        <w:widowControl/>
         <w:spacing w:after="120" w:line="288" w:lineRule="auto"/>
       </w:pPr>
       <w:r>
         <w:rPr>
           <w:rFonts w:ascii="Microsoft YaHei" w:hAnsi="Microsoft YaHei" w:eastAsia="微软雅黑"/>
           <w:b w:val="0"/>
-          <w:i w:val="0"/>
           <w:color w:val="1F2937"/>
           <w:sz w:val="22"/>
         </w:rPr>
-        <w:t>控制和遥测子路由复用公共登录权限。</w:t>
+        <w:t>感知/执行层：simulator_runtime.py 与 simulator_fleet.py 七测区监督器；每设备独立身份与 MQTT ACL，逐测区 SQLite 只保存模拟器本地执行状态，不是服务器业务数据库。</w:t>
       </w:r>
     </w:p>
     <w:p>
       <w:pPr>
         <w:pStyle w:val="ListBullet"/>
-        <w:spacing w:after="60" w:line="276" w:lineRule="auto"/>
-      </w:pPr>
-      <w:r>
-        <w:rPr>
-          <w:rFonts w:ascii="Microsoft YaHei" w:hAnsi="Microsoft YaHei" w:eastAsia="微软雅黑"/>
-          <w:b w:val="0"/>
-          <w:i w:val="0"/>
-          <w:color w:val="1F2937"/>
-          <w:sz w:val="22"/>
-        </w:rPr>
-        <w:t>感知/执行层：</w:t>
-      </w:r>
-      <w:r>
-        <w:rPr>
-          <w:rFonts w:ascii="Microsoft YaHei" w:hAnsi="Microsoft YaHei" w:eastAsia="微软雅黑"/>
-          <w:b w:val="0"/>
-          <w:i w:val="0"/>
-          <w:color w:val="1F2937"/>
-          <w:sz w:val="21"/>
-        </w:rPr>
-        <w:t>simulator_runtime.py</w:t>
-      </w:r>
-      <w:r>
-        <w:rPr>
-          <w:rFonts w:ascii="Microsoft YaHei" w:hAnsi="Microsoft YaHei" w:eastAsia="微软雅黑"/>
-          <w:b w:val="0"/>
-          <w:i w:val="0"/>
-          <w:color w:val="1F2937"/>
-          <w:sz w:val="22"/>
-        </w:rPr>
-        <w:t xml:space="preserve"> 与 </w:t>
-      </w:r>
-      <w:r>
-        <w:rPr>
-          <w:rFonts w:ascii="Microsoft YaHei" w:hAnsi="Microsoft YaHei" w:eastAsia="微软雅黑"/>
-          <w:b w:val="0"/>
-          <w:i w:val="0"/>
-          <w:color w:val="1F2937"/>
-          <w:sz w:val="21"/>
-        </w:rPr>
-        <w:t>simulator_fleet.py</w:t>
-      </w:r>
-      <w:r>
-        <w:rPr>
-          <w:rFonts w:ascii="Microsoft YaHei" w:hAnsi="Microsoft YaHei" w:eastAsia="微软雅黑"/>
-          <w:b w:val="0"/>
-          <w:i w:val="0"/>
-          <w:color w:val="1F2937"/>
-          <w:sz w:val="22"/>
-        </w:rPr>
-        <w:t xml:space="preserve"> 七测区监督器；每设备独立</w:t>
-      </w:r>
-    </w:p>
-    <w:p>
-      <w:pPr>
+        <w:widowControl/>
         <w:spacing w:after="120" w:line="288" w:lineRule="auto"/>
       </w:pPr>
       <w:r>
         <w:rPr>
           <w:rFonts w:ascii="Microsoft YaHei" w:hAnsi="Microsoft YaHei" w:eastAsia="微软雅黑"/>
           <w:b w:val="0"/>
-          <w:i w:val="0"/>
           <w:color w:val="1F2937"/>
           <w:sz w:val="22"/>
         </w:rPr>
-        <w:t>身份与 MQTT ACL，逐测区 SQLite 只保存模拟器本地执行状态，不是服务器业务数据库。</w:t>
+        <w:t>A 服务层：设备注册、心跳与在线离线、控制事务及回执、MQTT 接纳与持久收件队列、有界租约与重试、A→B 设备事件投递。</w:t>
       </w:r>
     </w:p>
     <w:p>
       <w:pPr>
         <w:pStyle w:val="ListBullet"/>
-        <w:spacing w:after="60" w:line="276" w:lineRule="auto"/>
-      </w:pPr>
-      <w:r>
-        <w:rPr>
-          <w:rFonts w:ascii="Microsoft YaHei" w:hAnsi="Microsoft YaHei" w:eastAsia="微软雅黑"/>
-          <w:b w:val="0"/>
-          <w:i w:val="0"/>
-          <w:color w:val="1F2937"/>
-          <w:sz w:val="22"/>
-        </w:rPr>
-        <w:t>A 服务层：设备注册、心跳与在线离线、控制事务及回执、MQTT 接纳与持久收件队列、有界</w:t>
-      </w:r>
-    </w:p>
-    <w:p>
-      <w:pPr>
+        <w:widowControl/>
         <w:spacing w:after="120" w:line="288" w:lineRule="auto"/>
       </w:pPr>
       <w:r>
         <w:rPr>
           <w:rFonts w:ascii="Microsoft YaHei" w:hAnsi="Microsoft YaHei" w:eastAsia="微软雅黑"/>
           <w:b w:val="0"/>
-          <w:i w:val="0"/>
-          <w:color w:val="1F2937"/>
-          <w:sz w:val="22"/>
-        </w:rPr>
-        <w:t>租约与重试、A→B 设备事件投递。</w:t>
-      </w:r>
-    </w:p>
-    <w:p>
-      <w:pPr>
-        <w:pStyle w:val="ListBullet"/>
-        <w:spacing w:after="60" w:line="276" w:lineRule="auto"/>
-      </w:pPr>
-      <w:r>
-        <w:rPr>
-          <w:rFonts w:ascii="Microsoft YaHei" w:hAnsi="Microsoft YaHei" w:eastAsia="微软雅黑"/>
-          <w:b w:val="0"/>
-          <w:i w:val="0"/>
           <w:color w:val="1F2937"/>
           <w:sz w:val="22"/>
         </w:rPr>
@@ -481,13 +174,13 @@
     <w:p>
       <w:pPr>
         <w:pStyle w:val="ListBullet"/>
-        <w:spacing w:after="60" w:line="276" w:lineRule="auto"/>
+        <w:widowControl/>
+        <w:spacing w:after="120" w:line="288" w:lineRule="auto"/>
       </w:pPr>
       <w:r>
         <w:rPr>
           <w:rFonts w:ascii="Microsoft YaHei" w:hAnsi="Microsoft YaHei" w:eastAsia="微软雅黑"/>
           <w:b w:val="0"/>
-          <w:i w:val="0"/>
           <w:color w:val="1F2937"/>
           <w:sz w:val="22"/>
         </w:rPr>
@@ -497,13 +190,13 @@
     <w:p>
       <w:pPr>
         <w:pStyle w:val="ListBullet"/>
-        <w:spacing w:after="60" w:line="276" w:lineRule="auto"/>
+        <w:widowControl/>
+        <w:spacing w:after="120" w:line="288" w:lineRule="auto"/>
       </w:pPr>
       <w:r>
         <w:rPr>
           <w:rFonts w:ascii="Microsoft YaHei" w:hAnsi="Microsoft YaHei" w:eastAsia="微软雅黑"/>
           <w:b w:val="0"/>
-          <w:i w:val="0"/>
           <w:color w:val="1F2937"/>
           <w:sz w:val="22"/>
         </w:rPr>
@@ -512,59 +205,29 @@
     </w:p>
     <w:p>
       <w:pPr>
+        <w:widowControl/>
         <w:spacing w:after="120" w:line="288" w:lineRule="auto"/>
       </w:pPr>
       <w:r>
         <w:rPr>
           <w:rFonts w:ascii="Microsoft YaHei" w:hAnsi="Microsoft YaHei" w:eastAsia="微软雅黑"/>
           <w:b w:val="0"/>
-          <w:i w:val="0"/>
           <w:color w:val="1F2937"/>
           <w:sz w:val="22"/>
         </w:rPr>
-        <w:t>进程启动不等于全部 worker 已运行；容器、进程与数据库需分别验证，不能只靠网页可打开</w:t>
-      </w:r>
-    </w:p>
-    <w:p>
-      <w:pPr>
-        <w:spacing w:after="120" w:line="288" w:lineRule="auto"/>
-      </w:pPr>
-      <w:r>
-        <w:rPr>
-          <w:rFonts w:ascii="Microsoft YaHei" w:hAnsi="Microsoft YaHei" w:eastAsia="微软雅黑"/>
-          <w:b w:val="0"/>
-          <w:i w:val="0"/>
-          <w:color w:val="1F2937"/>
-          <w:sz w:val="22"/>
-        </w:rPr>
-        <w:t>验收。隔离验证在 Windows 上 Docker 容器内进行：Python 3.14.8、PostgreSQL 18、固定摘要</w:t>
-      </w:r>
-    </w:p>
-    <w:p>
-      <w:pPr>
-        <w:spacing w:after="120" w:line="288" w:lineRule="auto"/>
-      </w:pPr>
-      <w:r>
-        <w:rPr>
-          <w:rFonts w:ascii="Microsoft YaHei" w:hAnsi="Microsoft YaHei" w:eastAsia="微软雅黑"/>
-          <w:b w:val="0"/>
-          <w:i w:val="0"/>
-          <w:color w:val="1F2937"/>
-          <w:sz w:val="22"/>
-        </w:rPr>
-        <w:t>Mosquitto，随机专属内部网络与 tmpfs 数据库；不修改宿主 Python，不发布 PG/MQTT 宿主端口。</w:t>
+        <w:t>进程启动不等于全部 worker 已运行；容器、进程与数据库需分别验证，不能只靠网页可打开验收。隔离验证在 Windows 上 Docker 容器内进行：Python 3.14.8、PostgreSQL 18、固定摘要Mosquitto，随机专属内部网络与 tmpfs 数据库；不修改宿主 Python，不发布 PG/MQTT 宿主端口。</w:t>
       </w:r>
     </w:p>
     <w:p>
       <w:pPr>
         <w:pStyle w:val="Heading2"/>
+        <w:keepNext/>
       </w:pPr>
       <w:r>
         <w:rPr>
           <w:rFonts w:ascii="Microsoft YaHei" w:hAnsi="Microsoft YaHei" w:eastAsia="微软雅黑"/>
           <w:b/>
-          <w:i w:val="0"/>
-          <w:color w:val="000000"/>
+          <w:color w:val="1F2937"/>
           <w:sz w:val="30"/>
         </w:rPr>
         <w:t>三、数据、控制与恢复路径</w:t>
@@ -572,344 +235,59 @@
     </w:p>
     <w:p>
       <w:pPr>
+        <w:widowControl/>
         <w:spacing w:after="120" w:line="288" w:lineRule="auto"/>
       </w:pPr>
       <w:r>
         <w:rPr>
           <w:rFonts w:ascii="Microsoft YaHei" w:hAnsi="Microsoft YaHei" w:eastAsia="微软雅黑"/>
           <w:b w:val="0"/>
-          <w:i w:val="0"/>
           <w:color w:val="1F2937"/>
           <w:sz w:val="22"/>
         </w:rPr>
-        <w:t>遥测链：设备温度消息 → A 校验身份/绑定并持久接纳 → C 同事务保存 raw/质量/观测 → 历史</w:t>
+        <w:t>遥测链：设备温度消息 → A 校验身份/绑定并持久接纳 → C 同事务保存 raw/质量/观测 → 历史页面与同快照 CSV → 调用方选择 B 生效历史规则 → C 门禁候选与持久 outbox → B 摄取接口接受、来源摘要回读与追溯 → 已提交事件通知派发 → SMTP 与飞书终端分别实收（末两步仍未签收）。同筛选 CSV 与页面/历史集合按完整 ID 对拍，不是只比条数或 Mock 响应。</w:t>
       </w:r>
     </w:p>
     <w:p>
       <w:pPr>
+        <w:widowControl/>
         <w:spacing w:after="120" w:line="288" w:lineRule="auto"/>
       </w:pPr>
       <w:r>
         <w:rPr>
           <w:rFonts w:ascii="Microsoft YaHei" w:hAnsi="Microsoft YaHei" w:eastAsia="微软雅黑"/>
           <w:b w:val="0"/>
-          <w:i w:val="0"/>
           <w:color w:val="1F2937"/>
           <w:sz w:val="22"/>
         </w:rPr>
-        <w:t>页面与同快照 CSV → 调用方选择 B 生效历史规则 → C 门禁候选与持久 outbox → B 摄取接口</w:t>
+        <w:t>控制链：登录用户下发 → 持久命令/尝试 → MQTT 执行设备 → 设备事务保存执行结果并返回原ACK → 服务端回执 → 后续温度采样反映制冷效果。仅创建命令、MQTT publish 成功或页面显示“发送”都不能写成已执行；设备 ACK 之后有新的温度数据才称执行闭环。同版十四设备为两库三批、14 在线、7 采集流、7 执行器 ACK 后降温、14 离线恢复追溯、重启不重发；其中多批高温候选经鉴权 ASGI HTTP 写入 B 并回读批次/规则版本匹配，ASGI 不是 TCP。控制实测温度下降（如 10.003187 → 9.851915 °C）是短时软件仿真，只证明 ACK 后数据变化，不是实物制冷或已降到恢复阈值。</w:t>
       </w:r>
     </w:p>
     <w:p>
       <w:pPr>
+        <w:widowControl/>
         <w:spacing w:after="120" w:line="288" w:lineRule="auto"/>
       </w:pPr>
       <w:r>
         <w:rPr>
           <w:rFonts w:ascii="Microsoft YaHei" w:hAnsi="Microsoft YaHei" w:eastAsia="微软雅黑"/>
           <w:b w:val="0"/>
-          <w:i w:val="0"/>
           <w:color w:val="1F2937"/>
           <w:sz w:val="22"/>
         </w:rPr>
-        <w:t>接受、来源摘要回读与追溯 → 已提交事件通知派发 → SMTP 与飞书终端分别实收（末两步仍未</w:t>
-      </w:r>
-    </w:p>
-    <w:p>
-      <w:pPr>
-        <w:spacing w:after="120" w:line="288" w:lineRule="auto"/>
-      </w:pPr>
-      <w:r>
-        <w:rPr>
-          <w:rFonts w:ascii="Microsoft YaHei" w:hAnsi="Microsoft YaHei" w:eastAsia="微软雅黑"/>
-          <w:b w:val="0"/>
-          <w:i w:val="0"/>
-          <w:color w:val="1F2937"/>
-          <w:sz w:val="22"/>
-        </w:rPr>
-        <w:t>签收）。同筛选 CSV 与页面/历史集合按完整 ID 对拍，不是只比条数或 Mock 响应。</w:t>
-      </w:r>
-    </w:p>
-    <w:p>
-      <w:pPr>
-        <w:spacing w:after="120" w:line="288" w:lineRule="auto"/>
-      </w:pPr>
-      <w:r>
-        <w:rPr>
-          <w:rFonts w:ascii="Microsoft YaHei" w:hAnsi="Microsoft YaHei" w:eastAsia="微软雅黑"/>
-          <w:b w:val="0"/>
-          <w:i w:val="0"/>
-          <w:color w:val="1F2937"/>
-          <w:sz w:val="22"/>
-        </w:rPr>
-        <w:t>控制链：登录用户下发 → 持久命令/尝试 → MQTT 执行设备 → 设备事务保存执行结果并返回原</w:t>
-      </w:r>
-    </w:p>
-    <w:p>
-      <w:pPr>
-        <w:spacing w:after="120" w:line="288" w:lineRule="auto"/>
-      </w:pPr>
-      <w:r>
-        <w:rPr>
-          <w:rFonts w:ascii="Microsoft YaHei" w:hAnsi="Microsoft YaHei" w:eastAsia="微软雅黑"/>
-          <w:b w:val="0"/>
-          <w:i w:val="0"/>
-          <w:color w:val="1F2937"/>
-          <w:sz w:val="22"/>
-        </w:rPr>
-        <w:t>ACK → 服务端回执 → 后续温度采样反映制冷效果。仅创建命令、MQTT publish 成功或页面显示</w:t>
-      </w:r>
-    </w:p>
-    <w:p>
-      <w:pPr>
-        <w:spacing w:after="120" w:line="288" w:lineRule="auto"/>
-      </w:pPr>
-      <w:r>
-        <w:rPr>
-          <w:rFonts w:ascii="Microsoft YaHei" w:hAnsi="Microsoft YaHei" w:eastAsia="微软雅黑"/>
-          <w:b w:val="0"/>
-          <w:i w:val="0"/>
-          <w:color w:val="1F2937"/>
-          <w:sz w:val="22"/>
-        </w:rPr>
-        <w:t>“发送”都不能写成已执行；设备 ACK 之后有新的温度数据才称执行闭环。同版十四设备为两库</w:t>
-      </w:r>
-    </w:p>
-    <w:p>
-      <w:pPr>
-        <w:spacing w:after="120" w:line="288" w:lineRule="auto"/>
-      </w:pPr>
-      <w:r>
-        <w:rPr>
-          <w:rFonts w:ascii="Microsoft YaHei" w:hAnsi="Microsoft YaHei" w:eastAsia="微软雅黑"/>
-          <w:b w:val="0"/>
-          <w:i w:val="0"/>
-          <w:color w:val="1F2937"/>
-          <w:sz w:val="22"/>
-        </w:rPr>
-        <w:t>三批、14 在线、7 采集流、7 执行器 ACK 后降温、14 离线恢复追溯、重启不重发；其中多批</w:t>
-      </w:r>
-    </w:p>
-    <w:p>
-      <w:pPr>
-        <w:spacing w:after="120" w:line="288" w:lineRule="auto"/>
-      </w:pPr>
-      <w:r>
-        <w:rPr>
-          <w:rFonts w:ascii="Microsoft YaHei" w:hAnsi="Microsoft YaHei" w:eastAsia="微软雅黑"/>
-          <w:b w:val="0"/>
-          <w:i w:val="0"/>
-          <w:color w:val="1F2937"/>
-          <w:sz w:val="22"/>
-        </w:rPr>
-        <w:t>高温候选经鉴权 ASGI HTTP 写入 B 并回读批次/规则版本匹配，ASGI 不是 TCP。控制实测温度</w:t>
-      </w:r>
-    </w:p>
-    <w:p>
-      <w:pPr>
-        <w:spacing w:after="120" w:line="288" w:lineRule="auto"/>
-      </w:pPr>
-      <w:r>
-        <w:rPr>
-          <w:rFonts w:ascii="Microsoft YaHei" w:hAnsi="Microsoft YaHei" w:eastAsia="微软雅黑"/>
-          <w:b w:val="0"/>
-          <w:i w:val="0"/>
-          <w:color w:val="1F2937"/>
-          <w:sz w:val="22"/>
-        </w:rPr>
-        <w:t>下降（如 10.003187 → 9.851915 °C）是短时软件仿真，只证明 ACK 后数据变化，不是实物制冷</w:t>
-      </w:r>
-    </w:p>
-    <w:p>
-      <w:pPr>
-        <w:spacing w:after="120" w:line="288" w:lineRule="auto"/>
-      </w:pPr>
-      <w:r>
-        <w:rPr>
-          <w:rFonts w:ascii="Microsoft YaHei" w:hAnsi="Microsoft YaHei" w:eastAsia="微软雅黑"/>
-          <w:b w:val="0"/>
-          <w:i w:val="0"/>
-          <w:color w:val="1F2937"/>
-          <w:sz w:val="22"/>
-        </w:rPr>
-        <w:t>或已降到恢复阈值。</w:t>
-      </w:r>
-    </w:p>
-    <w:p>
-      <w:pPr>
-        <w:spacing w:after="120" w:line="288" w:lineRule="auto"/>
-      </w:pPr>
-      <w:r>
-        <w:rPr>
-          <w:rFonts w:ascii="Microsoft YaHei" w:hAnsi="Microsoft YaHei" w:eastAsia="微软雅黑"/>
-          <w:b w:val="0"/>
-          <w:i w:val="0"/>
-          <w:color w:val="1F2937"/>
-          <w:sz w:val="22"/>
-        </w:rPr>
-        <w:t>恢复路径（main0e 受保护恢复后台发送候选）：</w:t>
-      </w:r>
-      <w:r>
-        <w:rPr>
-          <w:rFonts w:ascii="Microsoft YaHei" w:hAnsi="Microsoft YaHei" w:eastAsia="微软雅黑"/>
-          <w:b w:val="0"/>
-          <w:i w:val="0"/>
-          <w:color w:val="1F2937"/>
-          <w:sz w:val="21"/>
-        </w:rPr>
-        <w:t>RecoveryDeliveryWorker</w:t>
-      </w:r>
-      <w:r>
-        <w:rPr>
-          <w:rFonts w:ascii="Microsoft YaHei" w:hAnsi="Microsoft YaHei" w:eastAsia="微软雅黑"/>
-          <w:b w:val="0"/>
-          <w:i w:val="0"/>
-          <w:color w:val="1F2937"/>
-          <w:sz w:val="22"/>
-        </w:rPr>
-        <w:t xml:space="preserve"> 轮转发现每页最多</w:t>
-      </w:r>
-    </w:p>
-    <w:p>
-      <w:pPr>
-        <w:spacing w:after="120" w:line="288" w:lineRule="auto"/>
-      </w:pPr>
-      <w:r>
-        <w:rPr>
-          <w:rFonts w:ascii="Microsoft YaHei" w:hAnsi="Microsoft YaHei" w:eastAsia="微软雅黑"/>
-          <w:b w:val="0"/>
-          <w:i w:val="0"/>
-          <w:color w:val="1F2937"/>
-          <w:sz w:val="22"/>
-        </w:rPr>
-        <w:t>14 条到期恢复，在已核对设备/绑定/epoch 范围内，由 C 在同一 Connection/事务中锁设备、</w:t>
-      </w:r>
-    </w:p>
-    <w:p>
-      <w:pPr>
-        <w:spacing w:after="120" w:line="288" w:lineRule="auto"/>
-      </w:pPr>
-      <w:r>
-        <w:rPr>
-          <w:rFonts w:ascii="Microsoft YaHei" w:hAnsi="Microsoft YaHei" w:eastAsia="微软雅黑"/>
-          <w:b w:val="0"/>
-          <w:i w:val="0"/>
-          <w:color w:val="1F2937"/>
-          <w:sz w:val="22"/>
-        </w:rPr>
-        <w:t>重验完整前沿、保存证据并 CAS 领取；外层提交失败绝不传出临时 claim，提交成功且连接已</w:t>
-      </w:r>
-    </w:p>
-    <w:p>
-      <w:pPr>
-        <w:spacing w:after="120" w:line="288" w:lineRule="auto"/>
-      </w:pPr>
-      <w:r>
-        <w:rPr>
-          <w:rFonts w:ascii="Microsoft YaHei" w:hAnsi="Microsoft YaHei" w:eastAsia="微软雅黑"/>
-          <w:b w:val="0"/>
-          <w:i w:val="0"/>
-          <w:color w:val="1F2937"/>
-          <w:sz w:val="22"/>
-        </w:rPr>
-        <w:t>释放后才调用 C 的已领取发送口，该口重新确认当前租约、查 B 同来源、必要时 POST、核对原</w:t>
-      </w:r>
-    </w:p>
-    <w:p>
-      <w:pPr>
-        <w:spacing w:after="120" w:line="288" w:lineRule="auto"/>
-      </w:pPr>
-      <w:r>
-        <w:rPr>
-          <w:rFonts w:ascii="Microsoft YaHei" w:hAnsi="Microsoft YaHei" w:eastAsia="微软雅黑"/>
-          <w:b w:val="0"/>
-          <w:i w:val="0"/>
-          <w:color w:val="1F2937"/>
-          <w:sz w:val="22"/>
-        </w:rPr>
-        <w:t>异常已 resolved 再作 fenced 回执。独立 TCP 进程实际领取并回读原异常 resolved，重启一次</w:t>
-      </w:r>
-    </w:p>
-    <w:p>
-      <w:pPr>
-        <w:spacing w:after="120" w:line="288" w:lineRule="auto"/>
-      </w:pPr>
-      <w:r>
-        <w:rPr>
-          <w:rFonts w:ascii="Microsoft YaHei" w:hAnsi="Microsoft YaHei" w:eastAsia="微软雅黑"/>
-          <w:b w:val="0"/>
-          <w:i w:val="0"/>
-          <w:color w:val="1F2937"/>
-          <w:sz w:val="22"/>
-        </w:rPr>
-        <w:t>不重复投递、原正文/hash 不变、attempt=1；迟到更正由独立进程完成 B 双 ID 追溯。此角色</w:t>
-      </w:r>
-    </w:p>
-    <w:p>
-      <w:pPr>
-        <w:spacing w:after="120" w:line="288" w:lineRule="auto"/>
-      </w:pPr>
-      <w:r>
-        <w:rPr>
-          <w:rFonts w:ascii="Microsoft YaHei" w:hAnsi="Microsoft YaHei" w:eastAsia="微软雅黑"/>
-          <w:b w:val="0"/>
-          <w:i w:val="0"/>
-          <w:color w:val="1F2937"/>
-          <w:sz w:val="22"/>
-        </w:rPr>
-        <w:t xml:space="preserve">显式选择 </w:t>
-      </w:r>
-      <w:r>
-        <w:rPr>
-          <w:rFonts w:ascii="Microsoft YaHei" w:hAnsi="Microsoft YaHei" w:eastAsia="微软雅黑"/>
-          <w:b w:val="0"/>
-          <w:i w:val="0"/>
-          <w:color w:val="1F2937"/>
-          <w:sz w:val="21"/>
-        </w:rPr>
-        <w:t>deliver-recovery</w:t>
-      </w:r>
-      <w:r>
-        <w:rPr>
-          <w:rFonts w:ascii="Microsoft YaHei" w:hAnsi="Microsoft YaHei" w:eastAsia="微软雅黑"/>
-          <w:b w:val="0"/>
-          <w:i w:val="0"/>
-          <w:color w:val="1F2937"/>
-          <w:sz w:val="22"/>
-        </w:rPr>
-        <w:t xml:space="preserve"> 并提供 </w:t>
-      </w:r>
-      <w:r>
-        <w:rPr>
-          <w:rFonts w:ascii="Microsoft YaHei" w:hAnsi="Microsoft YaHei" w:eastAsia="微软雅黑"/>
-          <w:b w:val="0"/>
-          <w:i w:val="0"/>
-          <w:color w:val="1F2937"/>
-          <w:sz w:val="21"/>
-        </w:rPr>
-        <w:t>--confirm-recovery-contract</w:t>
-      </w:r>
-      <w:r>
-        <w:rPr>
-          <w:rFonts w:ascii="Microsoft YaHei" w:hAnsi="Microsoft YaHei" w:eastAsia="微软雅黑"/>
-          <w:b w:val="0"/>
-          <w:i w:val="0"/>
-          <w:color w:val="1F2937"/>
-          <w:sz w:val="22"/>
-        </w:rPr>
-        <w:t xml:space="preserve"> 才启动，不发送 SMTP/飞书。</w:t>
+        <w:t>恢复路径（main0e 受保护恢复后台发送候选）：RecoveryDeliveryWorker 轮转发现每页最多14 条到期恢复，在已核对设备/绑定/epoch 范围内，由 C 在同一 Connection/事务中锁设备、重验完整前沿、保存证据并 CAS 领取；外层提交失败绝不传出临时 claim，提交成功且连接已释放后才调用 C 的已领取发送口，该口重新确认当前租约、查 B 同来源、必要时 POST、核对原异常已 resolved 再作 fenced 回执。独立 TCP 进程实际领取并回读原异常 resolved，重启一次不重复投递、原正文/hash 不变、attempt=1；迟到更正由独立进程完成 B 双 ID 追溯。此角色显式选择 deliver-recovery 并提供 --confirm-recovery-contract 才启动，不发送 SMTP/飞书。</w:t>
       </w:r>
     </w:p>
     <w:p>
       <w:pPr>
         <w:pStyle w:val="Heading2"/>
+        <w:keepNext/>
       </w:pPr>
       <w:r>
         <w:rPr>
           <w:rFonts w:ascii="Microsoft YaHei" w:hAnsi="Microsoft YaHei" w:eastAsia="微软雅黑"/>
           <w:b/>
-          <w:i w:val="0"/>
-          <w:color w:val="000000"/>
+          <w:color w:val="1F2937"/>
           <w:sz w:val="30"/>
         </w:rPr>
         <w:t>四、事务、权限与追溯</w:t>
@@ -917,154 +295,44 @@
     </w:p>
     <w:p>
       <w:pPr>
+        <w:widowControl/>
         <w:spacing w:after="120" w:line="288" w:lineRule="auto"/>
       </w:pPr>
       <w:r>
         <w:rPr>
           <w:rFonts w:ascii="Microsoft YaHei" w:hAnsi="Microsoft YaHei" w:eastAsia="微软雅黑"/>
           <w:b w:val="0"/>
-          <w:i w:val="0"/>
           <w:color w:val="1F2937"/>
           <w:sz w:val="22"/>
         </w:rPr>
-        <w:t xml:space="preserve">A 提供的 </w:t>
-      </w:r>
-      <w:r>
-        <w:rPr>
-          <w:rFonts w:ascii="Microsoft YaHei" w:hAnsi="Microsoft YaHei" w:eastAsia="微软雅黑"/>
-          <w:b w:val="0"/>
-          <w:i w:val="0"/>
-          <w:color w:val="1F2937"/>
-          <w:sz w:val="21"/>
-        </w:rPr>
-        <w:t>begin_evidence_write</w:t>
-      </w:r>
-      <w:r>
-        <w:rPr>
-          <w:rFonts w:ascii="Microsoft YaHei" w:hAnsi="Microsoft YaHei" w:eastAsia="微软雅黑"/>
-          <w:b w:val="0"/>
-          <w:i w:val="0"/>
-          <w:color w:val="1F2937"/>
-          <w:sz w:val="22"/>
-        </w:rPr>
-        <w:t xml:space="preserve"> 要求 C 使用同一调用方 Connection 在写前取得同设备门禁、</w:t>
+        <w:t>A 提供的 begin_evidence_write 要求 C 使用同一调用方 Connection 在写前取得同设备门禁、写后保存冻结戳；没有覆盖所有写入口就不能启用自动恢复。网络派发不放在持数据库锁的事务内。A 保留原异常行锁、锁后重读、单调状态时间、事务失败回滚与 HTTP 503+Retry-After。设备采用逐设备账户/ACL，生产默认 TLS；隔离证明的明文 Broker 只在随机内部网络。</w:t>
       </w:r>
     </w:p>
     <w:p>
       <w:pPr>
+        <w:widowControl/>
         <w:spacing w:after="120" w:line="288" w:lineRule="auto"/>
       </w:pPr>
       <w:r>
         <w:rPr>
           <w:rFonts w:ascii="Microsoft YaHei" w:hAnsi="Microsoft YaHei" w:eastAsia="微软雅黑"/>
           <w:b w:val="0"/>
-          <w:i w:val="0"/>
           <w:color w:val="1F2937"/>
           <w:sz w:val="22"/>
         </w:rPr>
-        <w:t>写后保存冻结戳；没有覆盖所有写入口就不能启用自动恢复。网络派发不放在持数据库锁的事务</w:t>
-      </w:r>
-    </w:p>
-    <w:p>
-      <w:pPr>
-        <w:spacing w:after="120" w:line="288" w:lineRule="auto"/>
-      </w:pPr>
-      <w:r>
-        <w:rPr>
-          <w:rFonts w:ascii="Microsoft YaHei" w:hAnsi="Microsoft YaHei" w:eastAsia="微软雅黑"/>
-          <w:b w:val="0"/>
-          <w:i w:val="0"/>
-          <w:color w:val="1F2937"/>
-          <w:sz w:val="22"/>
-        </w:rPr>
-        <w:t>内。A 保留原异常行锁、锁后重读、单调状态时间、事务失败回滚与 HTTP 503+Retry-After。</w:t>
-      </w:r>
-    </w:p>
-    <w:p>
-      <w:pPr>
-        <w:spacing w:after="120" w:line="288" w:lineRule="auto"/>
-      </w:pPr>
-      <w:r>
-        <w:rPr>
-          <w:rFonts w:ascii="Microsoft YaHei" w:hAnsi="Microsoft YaHei" w:eastAsia="微软雅黑"/>
-          <w:b w:val="0"/>
-          <w:i w:val="0"/>
-          <w:color w:val="1F2937"/>
-          <w:sz w:val="22"/>
-        </w:rPr>
-        <w:t>设备采用逐设备账户/ACL，生产默认 TLS；隔离证明的明文 Broker 只在随机内部网络。</w:t>
-      </w:r>
-    </w:p>
-    <w:p>
-      <w:pPr>
-        <w:spacing w:after="120" w:line="288" w:lineRule="auto"/>
-      </w:pPr>
-      <w:r>
-        <w:rPr>
-          <w:rFonts w:ascii="Microsoft YaHei" w:hAnsi="Microsoft YaHei" w:eastAsia="微软雅黑"/>
-          <w:b w:val="0"/>
-          <w:i w:val="0"/>
-          <w:color w:val="1F2937"/>
-          <w:sz w:val="22"/>
-        </w:rPr>
-        <w:t>登录权限、摄取权限、设备身份与通知收件授权分别验证，不互相替代。异常恢复要求完整可信</w:t>
-      </w:r>
-    </w:p>
-    <w:p>
-      <w:pPr>
-        <w:spacing w:after="120" w:line="288" w:lineRule="auto"/>
-      </w:pPr>
-      <w:r>
-        <w:rPr>
-          <w:rFonts w:ascii="Microsoft YaHei" w:hAnsi="Microsoft YaHei" w:eastAsia="微软雅黑"/>
-          <w:b w:val="0"/>
-          <w:i w:val="0"/>
-          <w:color w:val="1F2937"/>
-          <w:sz w:val="22"/>
-        </w:rPr>
-        <w:t>窗口、关联原异常、重放/并发安全与晚到证据处理；不完整或停机缺口不能判正常，恢复关闭</w:t>
-      </w:r>
-    </w:p>
-    <w:p>
-      <w:pPr>
-        <w:spacing w:after="120" w:line="288" w:lineRule="auto"/>
-      </w:pPr>
-      <w:r>
-        <w:rPr>
-          <w:rFonts w:ascii="Microsoft YaHei" w:hAnsi="Microsoft YaHei" w:eastAsia="微软雅黑"/>
-          <w:b w:val="0"/>
-          <w:i w:val="0"/>
-          <w:color w:val="1F2937"/>
-          <w:sz w:val="22"/>
-        </w:rPr>
-        <w:t>异常也不删除原始超温与历史暴露。已有 attempt 的冻结恢复遇到新前沿时 C 仍保守 held，不</w:t>
-      </w:r>
-    </w:p>
-    <w:p>
-      <w:pPr>
-        <w:spacing w:after="120" w:line="288" w:lineRule="auto"/>
-      </w:pPr>
-      <w:r>
-        <w:rPr>
-          <w:rFonts w:ascii="Microsoft YaHei" w:hAnsi="Microsoft YaHei" w:eastAsia="微软雅黑"/>
-          <w:b w:val="0"/>
-          <w:i w:val="0"/>
-          <w:color w:val="1F2937"/>
-          <w:sz w:val="22"/>
-        </w:rPr>
-        <w:t>重写证据；本轮未证明所有延迟/新接收交错都能自动收敛，held 状态不写成恢复成功。</w:t>
+        <w:t>登录权限、摄取权限、设备身份与通知收件授权分别验证，不互相替代。异常恢复要求完整可信窗口、关联原异常、重放/并发安全与晚到证据处理；不完整或停机缺口不能判正常，恢复关闭异常也不删除原始超温与历史暴露。已有 attempt 的冻结恢复遇到新前沿时 C 仍保守 held，不重写证据；本轮未证明所有延迟/新接收交错都能自动收敛，held 状态不写成恢复成功。</w:t>
       </w:r>
     </w:p>
     <w:p>
       <w:pPr>
         <w:pStyle w:val="Heading2"/>
+        <w:keepNext/>
       </w:pPr>
       <w:r>
         <w:rPr>
           <w:rFonts w:ascii="Microsoft YaHei" w:hAnsi="Microsoft YaHei" w:eastAsia="微软雅黑"/>
           <w:b/>
-          <w:i w:val="0"/>
-          <w:color w:val="000000"/>
+          <w:color w:val="1F2937"/>
           <w:sz w:val="30"/>
         </w:rPr>
         <w:t>五、数据库与 ER 来源</w:t>
@@ -1072,504 +340,44 @@
     </w:p>
     <w:p>
       <w:pPr>
+        <w:widowControl/>
         <w:spacing w:after="120" w:line="288" w:lineRule="auto"/>
       </w:pPr>
       <w:r>
         <w:rPr>
           <w:rFonts w:ascii="Microsoft YaHei" w:hAnsi="Microsoft YaHei" w:eastAsia="微软雅黑"/>
           <w:b w:val="0"/>
-          <w:i w:val="0"/>
           <w:color w:val="1F2937"/>
           <w:sz w:val="22"/>
         </w:rPr>
-        <w:t>共同源码唯一迁移链为 A03→B01→A04→A05→C01，C01 是唯一 head，不是平行建表。在专属空库</w:t>
+        <w:t>共同源码唯一迁移链为 A03→B01→A04→A05→C01，C01 是唯一 head，不是平行建表。在专属空库实际升级并通过 model check 后，只读反射得到 33 张表；本附件不做第二次反射，直接引用docs/submission/design/ 已核对的图件与清单，33 表反射比较显示 changed_table_definitions为空（无 schema 变化）。三张核心 ER 图只展示 19 个核心实体、17 条已逐项与实际数据库外键核对的边，完整字段见数据字典 docs/submission/design/DATA-DICTIONARY.md，边见docs/submission/design/er-edges.json。</w:t>
       </w:r>
     </w:p>
     <w:p>
       <w:pPr>
+        <w:widowControl/>
         <w:spacing w:after="120" w:line="288" w:lineRule="auto"/>
       </w:pPr>
       <w:r>
         <w:rPr>
           <w:rFonts w:ascii="Microsoft YaHei" w:hAnsi="Microsoft YaHei" w:eastAsia="微软雅黑"/>
           <w:b w:val="0"/>
-          <w:i w:val="0"/>
           <w:color w:val="1F2937"/>
           <w:sz w:val="22"/>
         </w:rPr>
-        <w:t>实际升级并通过 model check 后，只读反射得到 33 张表；本附件不做第二次反射，直接引用</w:t>
-      </w:r>
-    </w:p>
-    <w:p>
-      <w:pPr>
-        <w:spacing w:after="120" w:line="288" w:lineRule="auto"/>
-      </w:pPr>
-      <w:r>
-        <w:rPr>
-          <w:rFonts w:ascii="Microsoft YaHei" w:hAnsi="Microsoft YaHei" w:eastAsia="微软雅黑"/>
-          <w:b w:val="0"/>
-          <w:i w:val="0"/>
-          <w:color w:val="1F2937"/>
-          <w:sz w:val="21"/>
-        </w:rPr>
-        <w:t>docs/submission/design/</w:t>
-      </w:r>
-      <w:r>
-        <w:rPr>
-          <w:rFonts w:ascii="Microsoft YaHei" w:hAnsi="Microsoft YaHei" w:eastAsia="微软雅黑"/>
-          <w:b w:val="0"/>
-          <w:i w:val="0"/>
-          <w:color w:val="1F2937"/>
-          <w:sz w:val="22"/>
-        </w:rPr>
-        <w:t xml:space="preserve"> 已核对的图件与清单，33 表反射比较显示 changed_table_definitions</w:t>
-      </w:r>
-    </w:p>
-    <w:p>
-      <w:pPr>
-        <w:spacing w:after="120" w:line="288" w:lineRule="auto"/>
-      </w:pPr>
-      <w:r>
-        <w:rPr>
-          <w:rFonts w:ascii="Microsoft YaHei" w:hAnsi="Microsoft YaHei" w:eastAsia="微软雅黑"/>
-          <w:b w:val="0"/>
-          <w:i w:val="0"/>
-          <w:color w:val="1F2937"/>
-          <w:sz w:val="22"/>
-        </w:rPr>
-        <w:t>为空（无 schema 变化）。三张核心 ER 图只展示 19 个核心实体、17 条已逐项与实际数据库外键</w:t>
-      </w:r>
-    </w:p>
-    <w:p>
-      <w:pPr>
-        <w:spacing w:after="120" w:line="288" w:lineRule="auto"/>
-      </w:pPr>
-      <w:r>
-        <w:rPr>
-          <w:rFonts w:ascii="Microsoft YaHei" w:hAnsi="Microsoft YaHei" w:eastAsia="微软雅黑"/>
-          <w:b w:val="0"/>
-          <w:i w:val="0"/>
-          <w:color w:val="1F2937"/>
-          <w:sz w:val="22"/>
-        </w:rPr>
-        <w:t xml:space="preserve">核对的边，完整字段见数据字典 </w:t>
-      </w:r>
-      <w:r>
-        <w:rPr>
-          <w:rFonts w:ascii="Microsoft YaHei" w:hAnsi="Microsoft YaHei" w:eastAsia="微软雅黑"/>
-          <w:b w:val="0"/>
-          <w:i w:val="0"/>
-          <w:color w:val="1F2937"/>
-          <w:sz w:val="21"/>
-        </w:rPr>
-        <w:t>docs/submission/design/DATA-DICTIONARY.md</w:t>
-      </w:r>
-      <w:r>
-        <w:rPr>
-          <w:rFonts w:ascii="Microsoft YaHei" w:hAnsi="Microsoft YaHei" w:eastAsia="微软雅黑"/>
-          <w:b w:val="0"/>
-          <w:i w:val="0"/>
-          <w:color w:val="1F2937"/>
-          <w:sz w:val="22"/>
-        </w:rPr>
-        <w:t>，边见</w:t>
-      </w:r>
-    </w:p>
-    <w:p>
-      <w:pPr>
-        <w:spacing w:after="120" w:line="288" w:lineRule="auto"/>
-      </w:pPr>
-      <w:r>
-        <w:rPr>
-          <w:rFonts w:ascii="Microsoft YaHei" w:hAnsi="Microsoft YaHei" w:eastAsia="微软雅黑"/>
-          <w:b w:val="0"/>
-          <w:i w:val="0"/>
-          <w:color w:val="1F2937"/>
-          <w:sz w:val="21"/>
-        </w:rPr>
-        <w:t>docs/submission/design/er-edges.json</w:t>
-      </w:r>
-      <w:r>
-        <w:rPr>
-          <w:rFonts w:ascii="Microsoft YaHei" w:hAnsi="Microsoft YaHei" w:eastAsia="微软雅黑"/>
-          <w:b w:val="0"/>
-          <w:i w:val="0"/>
-          <w:color w:val="1F2937"/>
-          <w:sz w:val="22"/>
-        </w:rPr>
-        <w:t>。</w:t>
-      </w:r>
-    </w:p>
-    <w:p>
-      <w:pPr>
-        <w:spacing w:after="120" w:line="288" w:lineRule="auto"/>
-      </w:pPr>
-      <w:r>
-        <w:rPr>
-          <w:rFonts w:ascii="Microsoft YaHei" w:hAnsi="Microsoft YaHei" w:eastAsia="微软雅黑"/>
-          <w:b w:val="0"/>
-          <w:i w:val="0"/>
-          <w:color w:val="1F2937"/>
-          <w:sz w:val="22"/>
-        </w:rPr>
-        <w:t xml:space="preserve">关键关系：心跳/冲突/在线事件和 </w:t>
-      </w:r>
-      <w:r>
-        <w:rPr>
-          <w:rFonts w:ascii="Microsoft YaHei" w:hAnsi="Microsoft YaHei" w:eastAsia="微软雅黑"/>
-          <w:b w:val="0"/>
-          <w:i w:val="0"/>
-          <w:color w:val="1F2937"/>
-          <w:sz w:val="21"/>
-        </w:rPr>
-        <w:t>iot_command</w:t>
-      </w:r>
-      <w:r>
-        <w:rPr>
-          <w:rFonts w:ascii="Microsoft YaHei" w:hAnsi="Microsoft YaHei" w:eastAsia="微软雅黑"/>
-          <w:b w:val="0"/>
-          <w:i w:val="0"/>
-          <w:color w:val="1F2937"/>
-          <w:sz w:val="22"/>
-        </w:rPr>
-        <w:t xml:space="preserve"> 通过外键引用 </w:t>
-      </w:r>
-      <w:r>
-        <w:rPr>
-          <w:rFonts w:ascii="Microsoft YaHei" w:hAnsi="Microsoft YaHei" w:eastAsia="微软雅黑"/>
-          <w:b w:val="0"/>
-          <w:i w:val="0"/>
-          <w:color w:val="1F2937"/>
-          <w:sz w:val="21"/>
-        </w:rPr>
-        <w:t>iot_device</w:t>
-      </w:r>
-      <w:r>
-        <w:rPr>
-          <w:rFonts w:ascii="Microsoft YaHei" w:hAnsi="Microsoft YaHei" w:eastAsia="微软雅黑"/>
-          <w:b w:val="0"/>
-          <w:i w:val="0"/>
-          <w:color w:val="1F2937"/>
-          <w:sz w:val="22"/>
-        </w:rPr>
-        <w:t>，命令设备外键删除</w:t>
-      </w:r>
-    </w:p>
-    <w:p>
-      <w:pPr>
-        <w:spacing w:after="120" w:line="288" w:lineRule="auto"/>
-      </w:pPr>
-      <w:r>
-        <w:rPr>
-          <w:rFonts w:ascii="Microsoft YaHei" w:hAnsi="Microsoft YaHei" w:eastAsia="微软雅黑"/>
-          <w:b w:val="0"/>
-          <w:i w:val="0"/>
-          <w:color w:val="1F2937"/>
-          <w:sz w:val="22"/>
-        </w:rPr>
-        <w:t>策略为 RESTRICT；</w:t>
-      </w:r>
-      <w:r>
-        <w:rPr>
-          <w:rFonts w:ascii="Microsoft YaHei" w:hAnsi="Microsoft YaHei" w:eastAsia="微软雅黑"/>
-          <w:b w:val="0"/>
-          <w:i w:val="0"/>
-          <w:color w:val="1F2937"/>
-          <w:sz w:val="21"/>
-        </w:rPr>
-        <w:t>iot_command_attempt</w:t>
-      </w:r>
-      <w:r>
-        <w:rPr>
-          <w:rFonts w:ascii="Microsoft YaHei" w:hAnsi="Microsoft YaHei" w:eastAsia="微软雅黑"/>
-          <w:b w:val="0"/>
-          <w:i w:val="0"/>
-          <w:color w:val="1F2937"/>
-          <w:sz w:val="22"/>
-        </w:rPr>
-        <w:t>/</w:t>
-      </w:r>
-      <w:r>
-        <w:rPr>
-          <w:rFonts w:ascii="Microsoft YaHei" w:hAnsi="Microsoft YaHei" w:eastAsia="微软雅黑"/>
-          <w:b w:val="0"/>
-          <w:i w:val="0"/>
-          <w:color w:val="1F2937"/>
-          <w:sz w:val="21"/>
-        </w:rPr>
-        <w:t>iot_command_receipt</w:t>
-      </w:r>
-      <w:r>
-        <w:rPr>
-          <w:rFonts w:ascii="Microsoft YaHei" w:hAnsi="Microsoft YaHei" w:eastAsia="微软雅黑"/>
-          <w:b w:val="0"/>
-          <w:i w:val="0"/>
-          <w:color w:val="1F2937"/>
-          <w:sz w:val="22"/>
-        </w:rPr>
-        <w:t xml:space="preserve"> 引用 </w:t>
-      </w:r>
-      <w:r>
-        <w:rPr>
-          <w:rFonts w:ascii="Microsoft YaHei" w:hAnsi="Microsoft YaHei" w:eastAsia="微软雅黑"/>
-          <w:b w:val="0"/>
-          <w:i w:val="0"/>
-          <w:color w:val="1F2937"/>
-          <w:sz w:val="21"/>
-        </w:rPr>
-        <w:t>iot_command</w:t>
-      </w:r>
-      <w:r>
-        <w:rPr>
-          <w:rFonts w:ascii="Microsoft YaHei" w:hAnsi="Microsoft YaHei" w:eastAsia="微软雅黑"/>
-          <w:b w:val="0"/>
-          <w:i w:val="0"/>
-          <w:color w:val="1F2937"/>
-          <w:sz w:val="22"/>
-        </w:rPr>
-        <w:t>，删除策略</w:t>
-      </w:r>
-    </w:p>
-    <w:p>
-      <w:pPr>
-        <w:spacing w:after="120" w:line="288" w:lineRule="auto"/>
-      </w:pPr>
-      <w:r>
-        <w:rPr>
-          <w:rFonts w:ascii="Microsoft YaHei" w:hAnsi="Microsoft YaHei" w:eastAsia="微软雅黑"/>
-          <w:b w:val="0"/>
-          <w:i w:val="0"/>
-          <w:color w:val="1F2937"/>
-          <w:sz w:val="22"/>
-        </w:rPr>
-        <w:t>为 CASCADE；</w:t>
-      </w:r>
-      <w:r>
-        <w:rPr>
-          <w:rFonts w:ascii="Microsoft YaHei" w:hAnsi="Microsoft YaHei" w:eastAsia="微软雅黑"/>
-          <w:b w:val="0"/>
-          <w:i w:val="0"/>
-          <w:color w:val="1F2937"/>
-          <w:sz w:val="21"/>
-        </w:rPr>
-        <w:t>alerts_warehouse → alerts_batch → alerts_batch_rule_snapshot</w:t>
-      </w:r>
-      <w:r>
-        <w:rPr>
-          <w:rFonts w:ascii="Microsoft YaHei" w:hAnsi="Microsoft YaHei" w:eastAsia="微软雅黑"/>
-          <w:b w:val="0"/>
-          <w:i w:val="0"/>
-          <w:color w:val="1F2937"/>
-          <w:sz w:val="22"/>
-        </w:rPr>
-        <w:t>；</w:t>
-      </w:r>
-    </w:p>
-    <w:p>
-      <w:pPr>
-        <w:spacing w:after="120" w:line="288" w:lineRule="auto"/>
-      </w:pPr>
-      <w:r>
-        <w:rPr>
-          <w:rFonts w:ascii="Microsoft YaHei" w:hAnsi="Microsoft YaHei" w:eastAsia="微软雅黑"/>
-          <w:b w:val="0"/>
-          <w:i w:val="0"/>
-          <w:color w:val="1F2937"/>
-          <w:sz w:val="21"/>
-        </w:rPr>
-        <w:t>alerts_event → alerts_status_transition</w:t>
-      </w:r>
-      <w:r>
-        <w:rPr>
-          <w:rFonts w:ascii="Microsoft YaHei" w:hAnsi="Microsoft YaHei" w:eastAsia="微软雅黑"/>
-          <w:b w:val="0"/>
-          <w:i w:val="0"/>
-          <w:color w:val="1F2937"/>
-          <w:sz w:val="22"/>
-        </w:rPr>
-        <w:t>/</w:t>
-      </w:r>
-      <w:r>
-        <w:rPr>
-          <w:rFonts w:ascii="Microsoft YaHei" w:hAnsi="Microsoft YaHei" w:eastAsia="微软雅黑"/>
-          <w:b w:val="0"/>
-          <w:i w:val="0"/>
-          <w:color w:val="1F2937"/>
-          <w:sz w:val="21"/>
-        </w:rPr>
-        <w:t>alerts_notification_attempt</w:t>
-      </w:r>
-      <w:r>
-        <w:rPr>
-          <w:rFonts w:ascii="Microsoft YaHei" w:hAnsi="Microsoft YaHei" w:eastAsia="微软雅黑"/>
-          <w:b w:val="0"/>
-          <w:i w:val="0"/>
-          <w:color w:val="1F2937"/>
-          <w:sz w:val="22"/>
-        </w:rPr>
-        <w:t>；C 质量、接收/评价、</w:t>
-      </w:r>
-    </w:p>
-    <w:p>
-      <w:pPr>
-        <w:spacing w:after="120" w:line="288" w:lineRule="auto"/>
-      </w:pPr>
-      <w:r>
-        <w:rPr>
-          <w:rFonts w:ascii="Microsoft YaHei" w:hAnsi="Microsoft YaHei" w:eastAsia="微软雅黑"/>
-          <w:b w:val="0"/>
-          <w:i w:val="0"/>
-          <w:color w:val="1F2937"/>
-          <w:sz w:val="22"/>
-        </w:rPr>
-        <w:t>outbox 与快照成员按边清单中的外键关联到观测；接收重用审计行关联原接收记录。`iot_device</w:t>
-      </w:r>
-    </w:p>
-    <w:p>
-      <w:pPr>
-        <w:spacing w:after="120" w:line="288" w:lineRule="auto"/>
-      </w:pPr>
-      <w:r>
-        <w:rPr>
-          <w:rFonts w:ascii="Microsoft YaHei" w:hAnsi="Microsoft YaHei" w:eastAsia="微软雅黑"/>
-          <w:b w:val="0"/>
-          <w:i w:val="0"/>
-          <w:color w:val="1F2937"/>
-          <w:sz w:val="22"/>
-        </w:rPr>
-        <w:t>.warehouse_id`、C 观测的设备/冷库 UUID、outbox 与 B 来源等属业务逻辑引用而非数据库外键，</w:t>
-      </w:r>
-    </w:p>
-    <w:p>
-      <w:pPr>
-        <w:spacing w:after="120" w:line="288" w:lineRule="auto"/>
-      </w:pPr>
-      <w:r>
-        <w:rPr>
-          <w:rFonts w:ascii="Microsoft YaHei" w:hAnsi="Microsoft YaHei" w:eastAsia="微软雅黑"/>
-          <w:b w:val="0"/>
-          <w:i w:val="0"/>
-          <w:color w:val="1F2937"/>
-          <w:sz w:val="22"/>
-        </w:rPr>
-        <w:t>不按字段同名擅自补线。这些表由三人各自模块共建，33 表并非全为 A 开发。图见</w:t>
-      </w:r>
-    </w:p>
-    <w:p>
-      <w:pPr>
-        <w:spacing w:after="120" w:line="288" w:lineRule="auto"/>
-      </w:pPr>
-      <w:r>
-        <w:rPr>
-          <w:rFonts w:ascii="Microsoft YaHei" w:hAnsi="Microsoft YaHei" w:eastAsia="微软雅黑"/>
-          <w:b w:val="0"/>
-          <w:i w:val="0"/>
-          <w:color w:val="1F2937"/>
-          <w:sz w:val="21"/>
-        </w:rPr>
-        <w:t>docs/submission/design/tikz_architecture.png</w:t>
-      </w:r>
-      <w:r>
-        <w:rPr>
-          <w:rFonts w:ascii="Microsoft YaHei" w:hAnsi="Microsoft YaHei" w:eastAsia="微软雅黑"/>
-          <w:b w:val="0"/>
-          <w:i w:val="0"/>
-          <w:color w:val="1F2937"/>
-          <w:sz w:val="22"/>
-        </w:rPr>
-        <w:t>、</w:t>
-      </w:r>
-      <w:r>
-        <w:rPr>
-          <w:rFonts w:ascii="Microsoft YaHei" w:hAnsi="Microsoft YaHei" w:eastAsia="微软雅黑"/>
-          <w:b w:val="0"/>
-          <w:i w:val="0"/>
-          <w:color w:val="1F2937"/>
-          <w:sz w:val="21"/>
-        </w:rPr>
-        <w:t>tikz_er_a.png</w:t>
-      </w:r>
-      <w:r>
-        <w:rPr>
-          <w:rFonts w:ascii="Microsoft YaHei" w:hAnsi="Microsoft YaHei" w:eastAsia="微软雅黑"/>
-          <w:b w:val="0"/>
-          <w:i w:val="0"/>
-          <w:color w:val="1F2937"/>
-          <w:sz w:val="22"/>
-        </w:rPr>
-        <w:t>、</w:t>
-      </w:r>
-      <w:r>
-        <w:rPr>
-          <w:rFonts w:ascii="Microsoft YaHei" w:hAnsi="Microsoft YaHei" w:eastAsia="微软雅黑"/>
-          <w:b w:val="0"/>
-          <w:i w:val="0"/>
-          <w:color w:val="1F2937"/>
-          <w:sz w:val="21"/>
-        </w:rPr>
-        <w:t>tikz_er_b.png</w:t>
-      </w:r>
-      <w:r>
-        <w:rPr>
-          <w:rFonts w:ascii="Microsoft YaHei" w:hAnsi="Microsoft YaHei" w:eastAsia="微软雅黑"/>
-          <w:b w:val="0"/>
-          <w:i w:val="0"/>
-          <w:color w:val="1F2937"/>
-          <w:sz w:val="22"/>
-        </w:rPr>
-        <w:t>、</w:t>
-      </w:r>
-    </w:p>
-    <w:p>
-      <w:pPr>
-        <w:spacing w:after="120" w:line="288" w:lineRule="auto"/>
-      </w:pPr>
-      <w:r>
-        <w:rPr>
-          <w:rFonts w:ascii="Microsoft YaHei" w:hAnsi="Microsoft YaHei" w:eastAsia="微软雅黑"/>
-          <w:b w:val="0"/>
-          <w:i w:val="0"/>
-          <w:color w:val="1F2937"/>
-          <w:sz w:val="21"/>
-        </w:rPr>
-        <w:t>tikz_er_c.png</w:t>
-      </w:r>
-      <w:r>
-        <w:rPr>
-          <w:rFonts w:ascii="Microsoft YaHei" w:hAnsi="Microsoft YaHei" w:eastAsia="微软雅黑"/>
-          <w:b w:val="0"/>
-          <w:i w:val="0"/>
-          <w:color w:val="1F2937"/>
-          <w:sz w:val="22"/>
-        </w:rPr>
-        <w:t>，均为实际编译渲染；最终冻结版若有模式变更须重新反射与出图，不能只替换</w:t>
-      </w:r>
-    </w:p>
-    <w:p>
-      <w:pPr>
-        <w:spacing w:after="120" w:line="288" w:lineRule="auto"/>
-      </w:pPr>
-      <w:r>
-        <w:rPr>
-          <w:rFonts w:ascii="Microsoft YaHei" w:hAnsi="Microsoft YaHei" w:eastAsia="微软雅黑"/>
-          <w:b w:val="0"/>
-          <w:i w:val="0"/>
-          <w:color w:val="1F2937"/>
-          <w:sz w:val="22"/>
-        </w:rPr>
-        <w:t>SHA 标签。</w:t>
+        <w:t>关键关系：心跳/冲突/在线事件和 iot_command 通过外键引用 iot_device，命令设备外键删除策略为 RESTRICT；iot_command_attempt/iot_command_receipt 引用 iot_command，删除策略为 CASCADE；alerts_warehouse → alerts_batch → alerts_batch_rule_snapshot；alerts_event → alerts_status_transition/alerts_notification_attempt；C 质量、接收/评价、outbox 与快照成员按边清单中的外键关联到观测；接收重用审计行关联原接收记录。iot_device.warehouse_id、C 观测的设备/冷库 UUID、outbox 与 B 来源等属业务逻辑引用而非数据库外键，不按字段同名擅自补线。这些表由三人各自模块共建，33 表并非全为 A 开发。图见docs/submission/design/tikz_architecture.png、tikz_er_a.png、tikz_er_b.png、tikz_er_c.png，均为实际编译渲染；最终冻结版若有模式变更须重新反射与出图，不能只替换SHA 标签。</w:t>
       </w:r>
     </w:p>
     <w:p>
       <w:pPr>
         <w:pStyle w:val="Heading2"/>
+        <w:keepNext/>
       </w:pPr>
       <w:r>
         <w:rPr>
           <w:rFonts w:ascii="Microsoft YaHei" w:hAnsi="Microsoft YaHei" w:eastAsia="微软雅黑"/>
           <w:b/>
-          <w:i w:val="0"/>
-          <w:color w:val="000000"/>
+          <w:color w:val="1F2937"/>
           <w:sz w:val="30"/>
         </w:rPr>
         <w:t>六、已实测与仍未验收</w:t>
@@ -1577,13 +385,13 @@
     </w:p>
     <w:p>
       <w:pPr>
+        <w:widowControl/>
         <w:spacing w:after="120" w:line="288" w:lineRule="auto"/>
       </w:pPr>
       <w:r>
         <w:rPr>
           <w:rFonts w:ascii="Microsoft YaHei" w:hAnsi="Microsoft YaHei" w:eastAsia="微软雅黑"/>
           <w:b w:val="0"/>
-          <w:i w:val="0"/>
           <w:color w:val="1F2937"/>
           <w:sz w:val="22"/>
         </w:rPr>
@@ -1594,32 +402,33 @@
       <w:tblPr>
         <w:tblStyle w:val="TableGrid"/>
         <w:tblW w:type="auto" w:w="0"/>
-        <w:jc w:val="center"/>
+        <w:tblLayout w:type="fixed"/>
         <w:tblLook w:firstColumn="1" w:firstRow="1" w:lastColumn="0" w:lastRow="0" w:noHBand="0" w:noVBand="1" w:val="04A0"/>
       </w:tblPr>
       <w:tblGrid>
-        <w:gridCol w:w="3061"/>
-        <w:gridCol w:w="3061"/>
-        <w:gridCol w:w="3061"/>
+        <w:gridCol w:w="1701"/>
+        <w:gridCol w:w="3175"/>
+        <w:gridCol w:w="4195"/>
       </w:tblGrid>
       <w:tr>
+        <w:trPr>
+          <w:cantSplit/>
+          <w:tblHeader/>
+        </w:trPr>
         <w:tc>
           <w:tcPr>
             <w:tcW w:type="dxa" w:w="1701"/>
-            <w:shd w:val="clear" w:fill="1F2937"/>
           </w:tcPr>
           <w:p>
             <w:pPr>
-              <w:spacing w:before="40" w:after="40"/>
+              <w:spacing w:after="60" w:line="264" w:lineRule="auto"/>
             </w:pPr>
-            <w:r/>
             <w:r>
               <w:rPr>
                 <w:rFonts w:ascii="Microsoft YaHei" w:hAnsi="Microsoft YaHei" w:eastAsia="微软雅黑"/>
                 <w:b/>
-                <w:i w:val="0"/>
-                <w:color w:val="FFFFFF"/>
-                <w:sz w:val="21"/>
+                <w:color w:val="1F2937"/>
+                <w:sz w:val="19"/>
               </w:rPr>
               <w:t>验证项</w:t>
             </w:r>
@@ -1627,21 +436,18 @@
         </w:tc>
         <w:tc>
           <w:tcPr>
-            <w:tcW w:type="dxa" w:w="3685"/>
-            <w:shd w:val="clear" w:fill="1F2937"/>
+            <w:tcW w:type="dxa" w:w="3175"/>
           </w:tcPr>
           <w:p>
             <w:pPr>
-              <w:spacing w:before="40" w:after="40"/>
+              <w:spacing w:after="60" w:line="264" w:lineRule="auto"/>
             </w:pPr>
-            <w:r/>
             <w:r>
               <w:rPr>
                 <w:rFonts w:ascii="Microsoft YaHei" w:hAnsi="Microsoft YaHei" w:eastAsia="微软雅黑"/>
                 <w:b/>
-                <w:i w:val="0"/>
-                <w:color w:val="FFFFFF"/>
-                <w:sz w:val="21"/>
+                <w:color w:val="1F2937"/>
+                <w:sz w:val="19"/>
               </w:rPr>
               <w:t>实际结果</w:t>
             </w:r>
@@ -1649,21 +455,18 @@
         </w:tc>
         <w:tc>
           <w:tcPr>
-            <w:tcW w:type="dxa" w:w="3685"/>
-            <w:shd w:val="clear" w:fill="1F2937"/>
+            <w:tcW w:type="dxa" w:w="4195"/>
           </w:tcPr>
           <w:p>
             <w:pPr>
-              <w:spacing w:before="40" w:after="40"/>
+              <w:spacing w:after="60" w:line="264" w:lineRule="auto"/>
             </w:pPr>
-            <w:r/>
             <w:r>
               <w:rPr>
                 <w:rFonts w:ascii="Microsoft YaHei" w:hAnsi="Microsoft YaHei" w:eastAsia="微软雅黑"/>
                 <w:b/>
-                <w:i w:val="0"/>
-                <w:color w:val="FFFFFF"/>
-                <w:sz w:val="21"/>
+                <w:color w:val="1F2937"/>
+                <w:sz w:val="19"/>
               </w:rPr>
               <w:t>证据与边界</w:t>
             </w:r>
@@ -1671,22 +474,23 @@
         </w:tc>
       </w:tr>
       <w:tr>
+        <w:trPr>
+          <w:cantSplit/>
+        </w:trPr>
         <w:tc>
           <w:tcPr>
             <w:tcW w:type="dxa" w:w="1701"/>
           </w:tcPr>
           <w:p>
             <w:pPr>
-              <w:spacing w:before="40" w:after="40"/>
+              <w:spacing w:after="60" w:line="264" w:lineRule="auto"/>
             </w:pPr>
-            <w:r/>
             <w:r>
               <w:rPr>
                 <w:rFonts w:ascii="Microsoft YaHei" w:hAnsi="Microsoft YaHei" w:eastAsia="微软雅黑"/>
                 <w:b w:val="0"/>
-                <w:i w:val="0"/>
                 <w:color w:val="1F2937"/>
-                <w:sz w:val="21"/>
+                <w:sz w:val="19"/>
               </w:rPr>
               <w:t>后端回归</w:t>
             </w:r>
@@ -1694,20 +498,18 @@
         </w:tc>
         <w:tc>
           <w:tcPr>
-            <w:tcW w:type="dxa" w:w="3685"/>
+            <w:tcW w:type="dxa" w:w="3175"/>
           </w:tcPr>
           <w:p>
             <w:pPr>
-              <w:spacing w:before="40" w:after="40"/>
+              <w:spacing w:after="60" w:line="264" w:lineRule="auto"/>
             </w:pPr>
-            <w:r/>
             <w:r>
               <w:rPr>
                 <w:rFonts w:ascii="Microsoft YaHei" w:hAnsi="Microsoft YaHei" w:eastAsia="微软雅黑"/>
                 <w:b w:val="0"/>
-                <w:i w:val="0"/>
                 <w:color w:val="1F2937"/>
-                <w:sz w:val="21"/>
+                <w:sz w:val="19"/>
               </w:rPr>
               <w:t>本地 1446 passed / 0 skipped / 91%；适用云端 1444 / 2 分别列</w:t>
             </w:r>
@@ -1715,43 +517,42 @@
         </w:tc>
         <w:tc>
           <w:tcPr>
-            <w:tcW w:type="dxa" w:w="3685"/>
+            <w:tcW w:type="dxa" w:w="4195"/>
           </w:tcPr>
           <w:p>
             <w:pPr>
-              <w:spacing w:before="40" w:after="40"/>
+              <w:spacing w:after="60" w:line="264" w:lineRule="auto"/>
             </w:pPr>
-            <w:r/>
             <w:r>
               <w:rPr>
                 <w:rFonts w:ascii="Microsoft YaHei" w:hAnsi="Microsoft YaHei" w:eastAsia="微软雅黑"/>
                 <w:b w:val="0"/>
-                <w:i w:val="0"/>
                 <w:color w:val="1F2937"/>
-                <w:sz w:val="21"/>
+                <w:sz w:val="19"/>
               </w:rPr>
-              <w:t>`work/a01-tests-20261026222407-79444/pytest.xml`；XML 汇总 tests=1755 含 subTests，不当新增用例</w:t>
+              <w:t>work/a01-tests-20261026222407-79444/pytest.xml；XML 汇总 tests=1755 含 subTests，不当新增用例</w:t>
             </w:r>
           </w:p>
         </w:tc>
       </w:tr>
       <w:tr>
+        <w:trPr>
+          <w:cantSplit/>
+        </w:trPr>
         <w:tc>
           <w:tcPr>
             <w:tcW w:type="dxa" w:w="1701"/>
           </w:tcPr>
           <w:p>
             <w:pPr>
-              <w:spacing w:before="40" w:after="40"/>
+              <w:spacing w:after="60" w:line="264" w:lineRule="auto"/>
             </w:pPr>
-            <w:r/>
             <w:r>
               <w:rPr>
                 <w:rFonts w:ascii="Microsoft YaHei" w:hAnsi="Microsoft YaHei" w:eastAsia="微软雅黑"/>
                 <w:b w:val="0"/>
-                <w:i w:val="0"/>
                 <w:color w:val="1F2937"/>
-                <w:sz w:val="21"/>
+                <w:sz w:val="19"/>
               </w:rPr>
               <w:t>受保护恢复后台 TCP</w:t>
             </w:r>
@@ -1759,20 +560,18 @@
         </w:tc>
         <w:tc>
           <w:tcPr>
-            <w:tcW w:type="dxa" w:w="3685"/>
+            <w:tcW w:type="dxa" w:w="3175"/>
           </w:tcPr>
           <w:p>
             <w:pPr>
-              <w:spacing w:before="40" w:after="40"/>
+              <w:spacing w:after="60" w:line="264" w:lineRule="auto"/>
             </w:pPr>
-            <w:r/>
             <w:r>
               <w:rPr>
                 <w:rFonts w:ascii="Microsoft YaHei" w:hAnsi="Microsoft YaHei" w:eastAsia="微软雅黑"/>
                 <w:b w:val="0"/>
-                <w:i w:val="0"/>
                 <w:color w:val="1F2937"/>
-                <w:sz w:val="21"/>
+                <w:sz w:val="19"/>
               </w:rPr>
               <w:t>独立进程 CAS 领取并回读原异常 resolved，重启不重发、attempt=1</w:t>
             </w:r>
@@ -1780,43 +579,42 @@
         </w:tc>
         <w:tc>
           <w:tcPr>
-            <w:tcW w:type="dxa" w:w="3685"/>
+            <w:tcW w:type="dxa" w:w="4195"/>
           </w:tcPr>
           <w:p>
             <w:pPr>
-              <w:spacing w:before="40" w:after="40"/>
+              <w:spacing w:after="60" w:line="264" w:lineRule="auto"/>
             </w:pPr>
-            <w:r/>
             <w:r>
               <w:rPr>
                 <w:rFonts w:ascii="Microsoft YaHei" w:hAnsi="Microsoft YaHei" w:eastAsia="微软雅黑"/>
                 <w:b w:val="0"/>
-                <w:i w:val="0"/>
                 <w:color w:val="1F2937"/>
-                <w:sz w:val="21"/>
+                <w:sz w:val="19"/>
               </w:rPr>
-              <w:t>`work/gated-a9aed80a7c84448d89612ba511419db9/runtime-composition.json`，source_revision 1c85ae2</w:t>
+              <w:t>work/gated-a9aed80a7c84448d89612ba511419db9/runtime-composition.json，source_revision 1c85ae2</w:t>
             </w:r>
           </w:p>
         </w:tc>
       </w:tr>
       <w:tr>
+        <w:trPr>
+          <w:cantSplit/>
+        </w:trPr>
         <w:tc>
           <w:tcPr>
             <w:tcW w:type="dxa" w:w="1701"/>
           </w:tcPr>
           <w:p>
             <w:pPr>
-              <w:spacing w:before="40" w:after="40"/>
+              <w:spacing w:after="60" w:line="264" w:lineRule="auto"/>
             </w:pPr>
-            <w:r/>
             <w:r>
               <w:rPr>
                 <w:rFonts w:ascii="Microsoft YaHei" w:hAnsi="Microsoft YaHei" w:eastAsia="微软雅黑"/>
                 <w:b w:val="0"/>
-                <w:i w:val="0"/>
                 <w:color w:val="1F2937"/>
-                <w:sz w:val="21"/>
+                <w:sz w:val="19"/>
               </w:rPr>
               <w:t>同版十四设备分段</w:t>
             </w:r>
@@ -1824,20 +622,18 @@
         </w:tc>
         <w:tc>
           <w:tcPr>
-            <w:tcW w:type="dxa" w:w="3685"/>
+            <w:tcW w:type="dxa" w:w="3175"/>
           </w:tcPr>
           <w:p>
             <w:pPr>
-              <w:spacing w:before="40" w:after="40"/>
+              <w:spacing w:after="60" w:line="264" w:lineRule="auto"/>
             </w:pPr>
-            <w:r/>
             <w:r>
               <w:rPr>
                 <w:rFonts w:ascii="Microsoft YaHei" w:hAnsi="Microsoft YaHei" w:eastAsia="微软雅黑"/>
                 <w:b w:val="0"/>
-                <w:i w:val="0"/>
                 <w:color w:val="1F2937"/>
-                <w:sz w:val="21"/>
+                <w:sz w:val="19"/>
               </w:rPr>
               <w:t>两库三批、14 在线、7 采集流、7 执行器 ACK 后降温、14 离线恢复、重启不重发、同快照 CSV 对拍</w:t>
             </w:r>
@@ -1845,43 +641,42 @@
         </w:tc>
         <w:tc>
           <w:tcPr>
-            <w:tcW w:type="dxa" w:w="3685"/>
+            <w:tcW w:type="dxa" w:w="4195"/>
           </w:tcPr>
           <w:p>
             <w:pPr>
-              <w:spacing w:before="40" w:after="40"/>
+              <w:spacing w:after="60" w:line="264" w:lineRule="auto"/>
             </w:pPr>
-            <w:r/>
             <w:r>
               <w:rPr>
                 <w:rFonts w:ascii="Microsoft YaHei" w:hAnsi="Microsoft YaHei" w:eastAsia="微软雅黑"/>
                 <w:b w:val="0"/>
-                <w:i w:val="0"/>
                 <w:color w:val="1F2937"/>
-                <w:sz w:val="21"/>
+                <w:sz w:val="19"/>
               </w:rPr>
-              <w:t>`work/gated-fleet-7cc435cc846e4b25935d311fa624ca8d/gated-fleet.json`</w:t>
+              <w:t>work/gated-fleet-7cc435cc846e4b25935d311fa624ca8d/gated-fleet.json</w:t>
             </w:r>
           </w:p>
         </w:tc>
       </w:tr>
       <w:tr>
+        <w:trPr>
+          <w:cantSplit/>
+        </w:trPr>
         <w:tc>
           <w:tcPr>
             <w:tcW w:type="dxa" w:w="1701"/>
           </w:tcPr>
           <w:p>
             <w:pPr>
-              <w:spacing w:before="40" w:after="40"/>
+              <w:spacing w:after="60" w:line="264" w:lineRule="auto"/>
             </w:pPr>
-            <w:r/>
             <w:r>
               <w:rPr>
                 <w:rFonts w:ascii="Microsoft YaHei" w:hAnsi="Microsoft YaHei" w:eastAsia="微软雅黑"/>
                 <w:b w:val="0"/>
-                <w:i w:val="0"/>
                 <w:color w:val="1F2937"/>
-                <w:sz w:val="21"/>
+                <w:sz w:val="19"/>
               </w:rPr>
               <w:t>应用镜像归档</w:t>
             </w:r>
@@ -1889,20 +684,18 @@
         </w:tc>
         <w:tc>
           <w:tcPr>
-            <w:tcW w:type="dxa" w:w="3685"/>
+            <w:tcW w:type="dxa" w:w="3175"/>
           </w:tcPr>
           <w:p>
             <w:pPr>
-              <w:spacing w:before="40" w:after="40"/>
+              <w:spacing w:after="60" w:line="264" w:lineRule="auto"/>
             </w:pPr>
-            <w:r/>
             <w:r>
               <w:rPr>
                 <w:rFonts w:ascii="Microsoft YaHei" w:hAnsi="Microsoft YaHei" w:eastAsia="微软雅黑"/>
                 <w:b w:val="0"/>
-                <w:i w:val="0"/>
                 <w:color w:val="1F2937"/>
-                <w:sz w:val="21"/>
+                <w:sz w:val="19"/>
               </w:rPr>
               <w:t>540475904 字节，sha256 f7a5e3d5…bc0b806；默认 CMD 真实 HTTP 健康/登录/注册/重复拒绝/详情通过</w:t>
             </w:r>
@@ -1910,43 +703,42 @@
         </w:tc>
         <w:tc>
           <w:tcPr>
-            <w:tcW w:type="dxa" w:w="3685"/>
+            <w:tcW w:type="dxa" w:w="4195"/>
           </w:tcPr>
           <w:p>
             <w:pPr>
-              <w:spacing w:before="40" w:after="40"/>
+              <w:spacing w:after="60" w:line="264" w:lineRule="auto"/>
             </w:pPr>
-            <w:r/>
             <w:r>
               <w:rPr>
                 <w:rFonts w:ascii="Microsoft YaHei" w:hAnsi="Microsoft YaHei" w:eastAsia="微软雅黑"/>
                 <w:b w:val="0"/>
-                <w:i w:val="0"/>
                 <w:color w:val="1F2937"/>
-                <w:sz w:val="21"/>
+                <w:sz w:val="19"/>
               </w:rPr>
-              <w:t>`work/image-archive-20261026231221-351a4765a356/image-archive.json`</w:t>
+              <w:t>work/image-archive-20261026231221-351a4765a356/image-archive.json</w:t>
             </w:r>
           </w:p>
         </w:tc>
       </w:tr>
       <w:tr>
+        <w:trPr>
+          <w:cantSplit/>
+        </w:trPr>
         <w:tc>
           <w:tcPr>
             <w:tcW w:type="dxa" w:w="1701"/>
           </w:tcPr>
           <w:p>
             <w:pPr>
-              <w:spacing w:before="40" w:after="40"/>
+              <w:spacing w:after="60" w:line="264" w:lineRule="auto"/>
             </w:pPr>
-            <w:r/>
             <w:r>
               <w:rPr>
                 <w:rFonts w:ascii="Microsoft YaHei" w:hAnsi="Microsoft YaHei" w:eastAsia="微软雅黑"/>
                 <w:b w:val="0"/>
-                <w:i w:val="0"/>
                 <w:color w:val="1F2937"/>
-                <w:sz w:val="21"/>
+                <w:sz w:val="19"/>
               </w:rPr>
               <w:t>33 表反射</w:t>
             </w:r>
@@ -1954,20 +746,18 @@
         </w:tc>
         <w:tc>
           <w:tcPr>
-            <w:tcW w:type="dxa" w:w="3685"/>
+            <w:tcW w:type="dxa" w:w="3175"/>
           </w:tcPr>
           <w:p>
             <w:pPr>
-              <w:spacing w:before="40" w:after="40"/>
+              <w:spacing w:after="60" w:line="264" w:lineRule="auto"/>
             </w:pPr>
-            <w:r/>
             <w:r>
               <w:rPr>
                 <w:rFonts w:ascii="Microsoft YaHei" w:hAnsi="Microsoft YaHei" w:eastAsia="微软雅黑"/>
                 <w:b w:val="0"/>
-                <w:i w:val="0"/>
                 <w:color w:val="1F2937"/>
-                <w:sz w:val="21"/>
+                <w:sz w:val="19"/>
               </w:rPr>
               <w:t>无 schema 变化</w:t>
             </w:r>
@@ -1975,22 +765,20 @@
         </w:tc>
         <w:tc>
           <w:tcPr>
-            <w:tcW w:type="dxa" w:w="3685"/>
+            <w:tcW w:type="dxa" w:w="4195"/>
           </w:tcPr>
           <w:p>
             <w:pPr>
-              <w:spacing w:before="40" w:after="40"/>
+              <w:spacing w:after="60" w:line="264" w:lineRule="auto"/>
             </w:pPr>
-            <w:r/>
             <w:r>
               <w:rPr>
                 <w:rFonts w:ascii="Microsoft YaHei" w:hAnsi="Microsoft YaHei" w:eastAsia="微软雅黑"/>
                 <w:b w:val="0"/>
-                <w:i w:val="0"/>
                 <w:color w:val="1F2937"/>
-                <w:sz w:val="21"/>
+                <w:sz w:val="19"/>
               </w:rPr>
-              <w:t>`work/notify-subset-c97d15c346fa49f2b2d845a49ec2425c/design-schema-comparison.json`</w:t>
+              <w:t>work/notify-subset-c97d15c346fa49f2b2d845a49ec2425c/design-schema-comparison.json</w:t>
             </w:r>
           </w:p>
         </w:tc>
@@ -1998,112 +786,17 @@
     </w:tbl>
     <w:p>
       <w:pPr>
-        <w:spacing w:after="80"/>
-      </w:pPr>
-    </w:p>
-    <w:p>
-      <w:pPr>
+        <w:widowControl/>
         <w:spacing w:after="120" w:line="288" w:lineRule="auto"/>
       </w:pPr>
       <w:r>
         <w:rPr>
           <w:rFonts w:ascii="Microsoft YaHei" w:hAnsi="Microsoft YaHei" w:eastAsia="微软雅黑"/>
           <w:b w:val="0"/>
-          <w:i w:val="0"/>
           <w:color w:val="1F2937"/>
           <w:sz w:val="22"/>
         </w:rPr>
-        <w:t>仍未验收（不写成通过）：SMTP 与飞书手机端两渠道授权实收、同一冻结版本完整 E1、最终同版</w:t>
-      </w:r>
-    </w:p>
-    <w:p>
-      <w:pPr>
-        <w:spacing w:after="120" w:line="288" w:lineRule="auto"/>
-      </w:pPr>
-      <w:r>
-        <w:rPr>
-          <w:rFonts w:ascii="Microsoft YaHei" w:hAnsi="Microsoft YaHei" w:eastAsia="微软雅黑"/>
-          <w:b w:val="0"/>
-          <w:i w:val="0"/>
-          <w:color w:val="1F2937"/>
-          <w:sz w:val="22"/>
-        </w:rPr>
-        <w:t>第二机复现、C 自动恢复与多批高温业务收尾、M01—M05 汇编与实际参赛投递。受控规则切换</w:t>
-      </w:r>
-    </w:p>
-    <w:p>
-      <w:pPr>
-        <w:spacing w:after="120" w:line="288" w:lineRule="auto"/>
-      </w:pPr>
-      <w:r>
-        <w:rPr>
-          <w:rFonts w:ascii="Microsoft YaHei" w:hAnsi="Microsoft YaHei" w:eastAsia="微软雅黑"/>
-          <w:b w:val="0"/>
-          <w:i w:val="0"/>
-          <w:color w:val="1F2937"/>
-          <w:sz w:val="22"/>
-        </w:rPr>
-        <w:t>（测试专用 1°C 阈值）是工程验证，不是果品温度真实升高；</w:t>
-      </w:r>
-      <w:r>
-        <w:rPr>
-          <w:rFonts w:ascii="Microsoft YaHei" w:hAnsi="Microsoft YaHei" w:eastAsia="微软雅黑"/>
-          <w:b w:val="0"/>
-          <w:i w:val="0"/>
-          <w:color w:val="1F2937"/>
-          <w:sz w:val="21"/>
-        </w:rPr>
-        <w:t>notifications_sent=0</w:t>
-      </w:r>
-      <w:r>
-        <w:rPr>
-          <w:rFonts w:ascii="Microsoft YaHei" w:hAnsi="Microsoft YaHei" w:eastAsia="微软雅黑"/>
-          <w:b w:val="0"/>
-          <w:i w:val="0"/>
-          <w:color w:val="1F2937"/>
-          <w:sz w:val="22"/>
-        </w:rPr>
-        <w:t>、</w:t>
-      </w:r>
-    </w:p>
-    <w:p>
-      <w:pPr>
-        <w:spacing w:after="120" w:line="288" w:lineRule="auto"/>
-      </w:pPr>
-      <w:r>
-        <w:rPr>
-          <w:rFonts w:ascii="Microsoft YaHei" w:hAnsi="Microsoft YaHei" w:eastAsia="微软雅黑"/>
-          <w:b w:val="0"/>
-          <w:i w:val="0"/>
-          <w:color w:val="1F2937"/>
-          <w:sz w:val="21"/>
-        </w:rPr>
-        <w:t>complete_e1=false</w:t>
-      </w:r>
-      <w:r>
-        <w:rPr>
-          <w:rFonts w:ascii="Microsoft YaHei" w:hAnsi="Microsoft YaHei" w:eastAsia="微软雅黑"/>
-          <w:b w:val="0"/>
-          <w:i w:val="0"/>
-          <w:color w:val="1F2937"/>
-          <w:sz w:val="22"/>
-        </w:rPr>
-        <w:t>。文档与代码编写使用了辅助工具，按赛事要求如实披露，不把辅助过程</w:t>
-      </w:r>
-    </w:p>
-    <w:p>
-      <w:pPr>
-        <w:spacing w:after="120" w:line="288" w:lineRule="auto"/>
-      </w:pPr>
-      <w:r>
-        <w:rPr>
-          <w:rFonts w:ascii="Microsoft YaHei" w:hAnsi="Microsoft YaHei" w:eastAsia="微软雅黑"/>
-          <w:b w:val="0"/>
-          <w:i w:val="0"/>
-          <w:color w:val="1F2937"/>
-          <w:sz w:val="22"/>
-        </w:rPr>
-        <w:t>写成纯人工开发经历。</w:t>
+        <w:t>仍未验收（不写成通过）：SMTP 与飞书手机端两渠道授权实收、同一冻结版本完整 E1、最终同版第二机复现、已证恢复/多批分段的同版联合验收、M01—M05 汇编与实际参赛投递。受控规则切换（测试专用 1°C 阈值）是工程验证，不是果品温度真实升高；notifications_sent=0、complete_e1=false。文档与代码编写使用了辅助工具，按赛事要求如实披露，不把辅助过程写成纯人工开发经历。</w:t>
       </w:r>
     </w:p>
     <w:sectPr>

</xml_diff>